<commit_message>
docs(bd): Ledcor dossier update - Deltek ledger figures + US development arm
$103,600 invoiced to date (LedgerAR 4001, billing through Jun 2026);
Trinity 354 vs Trinity Triangle resolved (two separate Deltek projects);
new Section 5E: Ledcor Development LP (Irvine) - ALARA San Diego,
Hercules Village, Sunny Creek phases, Englekirk incumbency, Santry/Voysey;
Lede Residence La Jolla precedent surfaced from KOR's own ledger.
US claims independently fact-checked (5 confirmed, 1 corrected).

Co-Authored-By: Claude Fable 5 <noreply@anthropic.com>
</commit_message>
<xml_diff>
--- a/docs/KOR-Ledcor-Dossier-2026-07-01.docx
+++ b/docs/KOR-Ledcor-Dossier-2026-07-01.docx
@@ -20,7 +20,7 @@
           <w:b/>
           <w:bCs/>
         </w:rPr>
-        <w:t>KOR Structural · Prepared 2026-07-01 · Every claim carries a source; anything unverified is labeled, and internal figures can be checked directly in Deltek</w:t>
+        <w:t>KOR Structural · Prepared 2026-07-01 · Updated 2026-07-02 (invoiced-revenue figures from the ledger; US development arm added) · Every claim carries a source; anything unverified is labeled, and internal figures can be checked directly in Deltek</w:t>
       </w:r>
     </w:p>
     <w:p>
@@ -73,7 +73,7 @@
     </w:p>
     <w:p>
       <w:r>
-        <w:pict w14:anchorId="1C71E72E">
+        <w:pict w14:anchorId="1E07121A">
           <v:rect id="_x0000_i1025" style="width:0;height:1.5pt" o:hralign="center" o:hrstd="t" o:hr="t"/>
         </w:pict>
       </w:r>
@@ -113,7 +113,17 @@
         <w:t>5 won fee proposals (~$560k) since April 2024</w:t>
       </w:r>
       <w:r>
-        <w:t xml:space="preserve"> with the Ledcor family, the latest February 2026, plus ~$361k submitted and pending. [KOR books — Deltek statuses AP/STC]</w:t>
+        <w:t xml:space="preserve"> with the Ledcor family, the latest February 2026, plus ~$361k submitted and pending — and the ledger shows </w:t>
+      </w:r>
+      <w:r>
+        <w:rPr>
+          <w:b/>
+          <w:bCs/>
+        </w:rPr>
+        <w:t>$103,600 invoiced to date, with three of the five projects billing as recently as June 2026</w:t>
+      </w:r>
+      <w:r>
+        <w:t>. The relationship is invoicing this month, not historical. [KOR books — Deltek statuses AP/STC; LedgerAR account 4001]</w:t>
       </w:r>
     </w:p>
     <w:p>
@@ -135,10 +145,7 @@
         <w:t>Ledcor’s development arm</w:t>
       </w:r>
       <w:r>
-        <w:t xml:space="preserve"> (Ledcor Property Investments — “LPI”</w:t>
-      </w:r>
-      <w:r>
-        <w:t xml:space="preserve">), largely on the </w:t>
+        <w:t xml:space="preserve"> (Ledcor Property Investments — “LPI”), largely on the </w:t>
       </w:r>
       <w:r>
         <w:rPr>
@@ -158,7 +165,10 @@
         <w:t>Three of its four rezonings were approved between Nov 2025 and May 2026</w:t>
       </w:r>
       <w:r>
-        <w:t xml:space="preserve"> — the program is converting toward development permits, with structural mobilization to follow over the next 12–24 months. No structural engineer is publicly identified on any of the four [I — an absence-of-evidence finding; see Section 7].</w:t>
+        <w:t xml:space="preserve"> </w:t>
+      </w:r>
+      <w:r>
+        <w:t>— the program is converting toward development permits, with structural mobilization to follow over the next 12–24 months. No structural engineer is publicly identified on any of the four [I — an absence-of-evidence finding; see Section 7].</w:t>
       </w:r>
     </w:p>
     <w:p>
@@ -177,10 +187,7 @@
         <w:t>Ledcor’s construction arm buys structural engineering only on design-build / early-contractor-involvement work</w:t>
       </w:r>
       <w:r>
-        <w:t xml:space="preserve"> </w:t>
-      </w:r>
-      <w:r>
-        <w:t xml:space="preserve">— currently two concurrent flagships, both with Fast+Epp (BC Children’s Centre for Health Complexity; BCIT Tall Timber). On its ordinary GC/CM work the </w:t>
+        <w:t xml:space="preserve"> — currently two concurrent flagships, both with Fast+Epp (BC Children’s Centre for Health Complexity; BCIT Tall Timber). On its ordinary GC/CM work the </w:t>
       </w:r>
       <w:r>
         <w:rPr>
@@ -222,20 +229,20 @@
         <w:t>(B)</w:t>
       </w:r>
       <w:r>
+        <w:t xml:space="preserve"> the design-build institutional lane via Ledcor’s preconstruction/BD people; </w:t>
+      </w:r>
+      <w:r>
+        <w:rPr>
+          <w:b/>
+          <w:bCs/>
+        </w:rPr>
+        <w:t>(C)</w:t>
+      </w:r>
+      <w:r>
         <w:t xml:space="preserve"> </w:t>
       </w:r>
       <w:r>
-        <w:t xml:space="preserve">the design-build institutional lane via Ledcor’s preconstruction/BD people; </w:t>
-      </w:r>
-      <w:r>
-        <w:rPr>
-          <w:b/>
-          <w:bCs/>
-        </w:rPr>
-        <w:t>(C)</w:t>
-      </w:r>
-      <w:r>
-        <w:t xml:space="preserve"> Alberta — KOR’s own CRM already holds two open Alberta-region Ledcor engagements; </w:t>
+        <w:t xml:space="preserve">Alberta — KOR’s own CRM already holds two open Alberta-region Ledcor engagements; </w:t>
       </w:r>
       <w:r>
         <w:rPr>
@@ -245,7 +252,17 @@
         <w:t>(D)</w:t>
       </w:r>
       <w:r>
-        <w:t xml:space="preserve"> mass-timber-adjacent institutional (differentiated from Fast+Epp, who hold the flagship).</w:t>
+        <w:t xml:space="preserve"> mass-timber-adjacent institutional (differentiated from Fast+Epp, who hold the flagship); </w:t>
+      </w:r>
+      <w:r>
+        <w:rPr>
+          <w:b/>
+          <w:bCs/>
+        </w:rPr>
+        <w:t>(E)</w:t>
+      </w:r>
+      <w:r>
+        <w:t xml:space="preserve"> Ledcor’s US development arm — building right now in San Diego, inside KOR’s own US market, with a family precedent already in KOR’s books (Section 5E).</w:t>
       </w:r>
     </w:p>
     <w:p>
@@ -257,6 +274,7 @@
         </w:numPr>
       </w:pPr>
       <w:r>
+        <w:lastRenderedPageBreak/>
         <w:t xml:space="preserve">This dossier includes an honest </w:t>
       </w:r>
       <w:r>
@@ -277,7 +295,10 @@
         <w:t>with</w:t>
       </w:r>
       <w:r>
-        <w:t xml:space="preserve"> those facts on the table, not by omitting them.</w:t>
+        <w:t xml:space="preserve"> </w:t>
+      </w:r>
+      <w:r>
+        <w:t>those facts on the table, not by omitting them.</w:t>
       </w:r>
     </w:p>
     <w:p>
@@ -500,7 +521,6 @@
               <w:rPr>
                 <w:sz w:val="17"/>
               </w:rPr>
-              <w:lastRenderedPageBreak/>
               <w:t>2212 W 10th Ave, Vancouver</w:t>
             </w:r>
           </w:p>
@@ -1208,20 +1228,14 @@
         </w:numPr>
       </w:pPr>
       <w:r>
-        <w:t xml:space="preserve">KOR’s CRM also holds </w:t>
-      </w:r>
-      <w:r>
-        <w:rPr>
-          <w:b/>
-          <w:bCs/>
-        </w:rPr>
-        <w:t>two open Alberta-region Ledcor engagements</w:t>
-      </w:r>
-      <w:r>
-        <w:t xml:space="preserve"> </w:t>
-      </w:r>
-      <w:r>
-        <w:t>(early-stage, owners on file). The Alberta angle is already open in our own system.</w:t>
+        <w:rPr>
+          <w:b/>
+          <w:bCs/>
+        </w:rPr>
+        <w:t>Invoiced to date [Deltek LedgerAR, revenue account 4001]: $103,600 across five projects</w:t>
+      </w:r>
+      <w:r>
+        <w:t xml:space="preserve"> — 6486 Chester St $30,000 (billing Nov 2024 – Jun 2026), Telus CO Regent $27,600 (Aug 2025 – Jun 2026), 730 Raymur $25,000 (Jul 2025 – Jan 2026), Telus CO White Rock $11,000 (Feb – Jun 2026), Regent 2212 W 10th $10,000 (Jul 2024 – Jan 2025). These are invoiced dollars, not proposal values — and three of the five projects issued invoices in June 2026.</w:t>
       </w:r>
     </w:p>
     <w:p>
@@ -1233,14 +1247,82 @@
         </w:numPr>
       </w:pPr>
       <w:r>
+        <w:t xml:space="preserve">The ledger also carries the </w:t>
+      </w:r>
+      <w:r>
+        <w:rPr>
+          <w:b/>
+          <w:bCs/>
+        </w:rPr>
+        <w:t>older Ledcor Construction relationship</w:t>
+      </w:r>
+      <w:r>
+        <w:t xml:space="preserve">: Parksville Civic and Technology Centre, the RockRidge Canyon Club Room, West Vancouver residential consultations — and the </w:t>
+      </w:r>
+      <w:r>
+        <w:rPr>
+          <w:b/>
+          <w:bCs/>
+        </w:rPr>
+        <w:t>Lede Residence in La Jolla, California</w:t>
+      </w:r>
+      <w:r>
+        <w:t>. KOR has already done work for the Lede family in Southern California (relevant to Section 5E).</w:t>
+      </w:r>
+    </w:p>
+    <w:p>
+      <w:pPr>
+        <w:pStyle w:val="Compact"/>
+        <w:numPr>
+          <w:ilvl w:val="0"/>
+          <w:numId w:val="3"/>
+        </w:numPr>
+      </w:pPr>
+      <w:r>
+        <w:t xml:space="preserve">KOR’s CRM also holds </w:t>
+      </w:r>
+      <w:r>
+        <w:rPr>
+          <w:b/>
+          <w:bCs/>
+        </w:rPr>
+        <w:t>two open Alberta-region Ledcor engagements</w:t>
+      </w:r>
+      <w:r>
+        <w:t xml:space="preserve"> (early-stage, owners on file). The Alberta angle is already open in our own system.</w:t>
+      </w:r>
+    </w:p>
+    <w:p>
+      <w:pPr>
+        <w:pStyle w:val="Compact"/>
+        <w:numPr>
+          <w:ilvl w:val="0"/>
+          <w:numId w:val="3"/>
+        </w:numPr>
+      </w:pPr>
+      <w:r>
         <w:rPr>
           <w:i/>
           <w:iCs/>
         </w:rPr>
+        <w:lastRenderedPageBreak/>
         <w:t>Data note:</w:t>
       </w:r>
       <w:r>
-        <w:t xml:space="preserve"> the pursuit list contains Deltek sync duplicates (same project at several stages). The table above aggregates per project using the Deltek status codes (AP = accepted, STC = submitted) as the source of truth.</w:t>
+        <w:t xml:space="preserve"> </w:t>
+      </w:r>
+      <w:r>
+        <w:t xml:space="preserve">the pursuit list contains Deltek sync duplicates (same project at several stages). The table above aggregates per project using the Deltek status codes (AP = accepted, STC = submitted) as the source of truth. The two “Trinity E 10th” entries are </w:t>
+      </w:r>
+      <w:r>
+        <w:rPr>
+          <w:b/>
+          <w:bCs/>
+        </w:rPr>
+        <w:t>not</w:t>
+      </w:r>
+      <w:r>
+        <w:t xml:space="preserve"> duplicates: Deltek carries Trinity 354 E 10th (20159) and Trinity Triangle East 10th (20476) as separate regular projects — confirm the scope split with the project manager before follow-up.</w:t>
       </w:r>
     </w:p>
     <w:p>
@@ -1279,10 +1361,7 @@
         <w:t>Vancouver</w:t>
       </w:r>
       <w:r>
-        <w:t xml:space="preserve"> (1055 W Hastings) and San Diego (US). Edmonton is a branch office — the old </w:t>
-      </w:r>
-      <w:r>
-        <w:t>“dual-HQ” description is outdated.</w:t>
+        <w:t xml:space="preserve"> (1055 W Hastings) and San Diego (US). Edmonton is a branch office — the old “dual-HQ” description is outdated.</w:t>
       </w:r>
     </w:p>
     <w:p>
@@ -1370,10 +1449,7 @@
         <w:t>Russell Zirnhelt — EVP, Ledcor Construction Ltd</w:t>
       </w:r>
       <w:r>
-        <w:t xml:space="preserve"> </w:t>
-      </w:r>
-      <w:r>
-        <w:t xml:space="preserve">(heads building construction Canada-wide). Development: </w:t>
+        <w:t xml:space="preserve"> (heads building construction Canada-wide). Development: </w:t>
       </w:r>
       <w:r>
         <w:rPr>
@@ -1399,7 +1475,6 @@
           <w:b/>
           <w:bCs/>
         </w:rPr>
-        <w:lastRenderedPageBreak/>
         <w:t>Scale [I — estimates only, no audited figures]:</w:t>
       </w:r>
       <w:r>
@@ -1433,10 +1508,7 @@
         <w:t>top-3–5 Canadian contractor</w:t>
       </w:r>
       <w:r>
-        <w:t xml:space="preserve"> </w:t>
-      </w:r>
-      <w:r>
-        <w:t>(On-Site Magazine rankings; table gated). Treat all three as estimates.</w:t>
+        <w:t xml:space="preserve"> (On-Site Magazine rankings; table gated). Treat all three as estimates.</w:t>
       </w:r>
     </w:p>
     <w:p>
@@ -1500,10 +1572,7 @@
         <w:t>owner or architect</w:t>
       </w:r>
       <w:r>
-        <w:t xml:space="preserve"> </w:t>
-      </w:r>
-      <w:r>
-        <w:t xml:space="preserve">procures the structural engineer — Ledcor doesn’t hold that decision. Ledcor picks the structural engineer only where it owns the design: </w:t>
+        <w:t xml:space="preserve"> procures the structural engineer — Ledcor doesn’t hold that decision. Ledcor picks the structural engineer only where it owns the design: </w:t>
       </w:r>
       <w:r>
         <w:rPr>
@@ -1748,6 +1817,7 @@
               <w:rPr>
                 <w:sz w:val="17"/>
               </w:rPr>
+              <w:lastRenderedPageBreak/>
               <w:t>BCIT Tall Timber Student Housing (12-st CLT)</w:t>
             </w:r>
           </w:p>
@@ -2059,7 +2129,13 @@
               <w:rPr>
                 <w:sz w:val="17"/>
               </w:rPr>
-              <w:t xml:space="preserve"> (built by Urban One; F+E structural) — a common misattribution, corrected here</w:t>
+              <w:t xml:space="preserve"> </w:t>
+            </w:r>
+            <w:r>
+              <w:rPr>
+                <w:sz w:val="17"/>
+              </w:rPr>
+              <w:t>(built by Urban One; F+E structural) — a common misattribution, corrected here</w:t>
             </w:r>
           </w:p>
         </w:tc>
@@ -2126,11 +2202,7 @@
         <w:t>Barry Murphy</w:t>
       </w:r>
       <w:r>
-        <w:t xml:space="preserve"> (Director of Business Development). No “Design Manager, Building </w:t>
-      </w:r>
-      <w:r>
-        <w:lastRenderedPageBreak/>
-        <w:t xml:space="preserve">Construction” is publicly named — this dossier does not invent one. There is </w:t>
+        <w:t xml:space="preserve"> (Director of Business Development). No “Design Manager, Building Construction” is publicly named — this dossier does not invent one. There is </w:t>
       </w:r>
       <w:r>
         <w:rPr>
@@ -2233,10 +2305,24 @@
         <w:t>John Bryson &amp; Partners (now BMZ)</w:t>
       </w:r>
       <w:r>
-        <w:t xml:space="preserve"> on a past tower (The Charleson), and Fast+Epp holds the construction arm’s flagships — but KOR’s five wins since 2024 make KOR the program’s current incumbent. One bookkeeping item: “Trinity 354 E 10th” and “Trinity Triangle E 10th” </w:t>
-      </w:r>
-      <w:r>
-        <w:t xml:space="preserve">may be one pursuit at two Deltek stages — resolve in Deltek before follow-up. Action: close all three pending proposals; ask LPI (Lorne Wolinsky, VP Development, Vancouver) for program-wide coverage as the approvals convert. </w:t>
+        <w:t xml:space="preserve"> on a past tower (The Charleson), and Fast+Epp holds the construction arm’s flagships — but KOR’s </w:t>
+      </w:r>
+      <w:r>
+        <w:lastRenderedPageBreak/>
+        <w:t xml:space="preserve">five wins since 2024 make KOR the program’s current incumbent. The earlier “Trinity” bookkeeping question is resolved: Deltek carries Trinity 354 E 10th and Trinity Triangle E 10th as </w:t>
+      </w:r>
+      <w:r>
+        <w:rPr>
+          <w:b/>
+          <w:bCs/>
+        </w:rPr>
+        <w:t>two separate projects</w:t>
+      </w:r>
+      <w:r>
+        <w:t xml:space="preserve"> </w:t>
+      </w:r>
+      <w:r>
+        <w:t xml:space="preserve">(20159, 20476) — two opportunities, not one. Action: close all three pending proposals; ask LPI (Lorne Wolinsky, VP Development, Vancouver) for program-wide coverage as the approvals convert. </w:t>
       </w:r>
       <w:r>
         <w:rPr>
@@ -2352,18 +2438,40 @@
         <w:t>next tier</w:t>
       </w:r>
       <w:r>
-        <w:t xml:space="preserve"> of institutional timber (the Northern Lights/Equilibrium precedent shows they use specialist SEs project-by-project).</w:t>
-      </w:r>
-    </w:p>
-    <w:p>
-      <w:pPr>
-        <w:pStyle w:val="Heading2"/>
-      </w:pPr>
-      <w:bookmarkStart w:id="6" w:name="people-verified-only"/>
-      <w:bookmarkEnd w:id="5"/>
-      <w:r>
-        <w:lastRenderedPageBreak/>
-        <w:t>6. People (verified only)</w:t>
+        <w:t xml:space="preserve"> of institutional timber (the Northern Lights/Equilibrium precedent shows they use specialist SEs project-by-project). </w:t>
+      </w:r>
+      <w:r>
+        <w:rPr>
+          <w:b/>
+          <w:bCs/>
+        </w:rPr>
+        <w:t>E. The US development arm — in KOR’s own backyard. [V — added 2026-07-02, independently fact-checked]</w:t>
+      </w:r>
+      <w:r>
+        <w:t xml:space="preserve"> Ledcor</w:t>
+      </w:r>
+      <w:r>
+        <w:t xml:space="preserve"> </w:t>
+      </w:r>
+      <w:r>
+        <w:rPr>
+          <w:b/>
+          <w:bCs/>
+        </w:rPr>
+        <w:t>sold its California general-contracting business in 2019</w:t>
+      </w:r>
+      <w:r>
+        <w:t xml:space="preserve"> (Napa operation to davisReed, by its own press release, to refocus on property development and telecom) — so its real US buildings play is </w:t>
+      </w:r>
+      <w:r>
+        <w:rPr>
+          <w:b/>
+          <w:bCs/>
+        </w:rPr>
+        <w:t>Ledcor Development LP, headquartered in Irvine, CA</w:t>
+      </w:r>
+      <w:r>
+        <w:t>: a steady, modest developer with roughly seven California projects plus one in Redmond, WA since 2016. What’s live now:</w:t>
       </w:r>
     </w:p>
     <w:tbl>
@@ -2407,7 +2515,7 @@
                 <w:b w:val="0"/>
                 <w:sz w:val="17"/>
               </w:rPr>
-              <w:t>Person</w:t>
+              <w:t>Project</w:t>
             </w:r>
           </w:p>
         </w:tc>
@@ -2428,7 +2536,7 @@
                 <w:b w:val="0"/>
                 <w:sz w:val="17"/>
               </w:rPr>
-              <w:t>Title</w:t>
+              <w:t>Where</w:t>
             </w:r>
           </w:p>
         </w:tc>
@@ -2449,7 +2557,7 @@
                 <w:b w:val="0"/>
                 <w:sz w:val="17"/>
               </w:rPr>
-              <w:t>Where</w:t>
+              <w:t>Scale</w:t>
             </w:r>
           </w:p>
         </w:tc>
@@ -2470,7 +2578,7 @@
                 <w:b w:val="0"/>
                 <w:sz w:val="17"/>
               </w:rPr>
-              <w:t>Contact</w:t>
+              <w:t>Status</w:t>
             </w:r>
           </w:p>
         </w:tc>
@@ -2493,74 +2601,84 @@
             </w:pPr>
             <w:r>
               <w:rPr>
-                <w:sz w:val="17"/>
-              </w:rPr>
-              <w:t>Russell Zirnhelt</w:t>
-            </w:r>
-          </w:p>
-        </w:tc>
-        <w:tc>
-          <w:tcPr>
-            <w:tcW w:w="1250" w:type="pct"/>
-          </w:tcPr>
-          <w:p>
-            <w:pPr>
-              <w:pStyle w:val="Compact"/>
-              <w:rPr>
-                <w:sz w:val="17"/>
-              </w:rPr>
-            </w:pPr>
-            <w:r>
-              <w:rPr>
-                <w:sz w:val="17"/>
-              </w:rPr>
-              <w:t>EVP, Ledcor Construction Ltd (buildings, Canada-wide)</w:t>
-            </w:r>
-          </w:p>
-        </w:tc>
-        <w:tc>
-          <w:tcPr>
-            <w:tcW w:w="1250" w:type="pct"/>
-          </w:tcPr>
-          <w:p>
-            <w:pPr>
-              <w:pStyle w:val="Compact"/>
-              <w:rPr>
-                <w:sz w:val="17"/>
-              </w:rPr>
-            </w:pPr>
-            <w:r>
-              <w:rPr>
-                <w:sz w:val="17"/>
-              </w:rPr>
-              <w:t>Vancouver</w:t>
-            </w:r>
-          </w:p>
-        </w:tc>
-        <w:tc>
-          <w:tcPr>
-            <w:tcW w:w="1250" w:type="pct"/>
-          </w:tcPr>
-          <w:p>
-            <w:pPr>
-              <w:pStyle w:val="Compact"/>
-              <w:rPr>
-                <w:sz w:val="17"/>
-              </w:rPr>
-            </w:pPr>
-            <w:r>
-              <w:rPr>
-                <w:sz w:val="17"/>
-              </w:rPr>
-              <w:t xml:space="preserve">russell.zirnhelt@ledcor.com </w:t>
-            </w:r>
-            <w:r>
-              <w:rPr>
-                <w:i/>
-                <w:iCs/>
-                <w:sz w:val="17"/>
-              </w:rPr>
-              <w:t>(inferred pattern, unconfirmed)</w:t>
+                <w:b/>
+                <w:bCs/>
+                <w:sz w:val="17"/>
+              </w:rPr>
+              <w:t>ALARA</w:t>
+            </w:r>
+          </w:p>
+        </w:tc>
+        <w:tc>
+          <w:tcPr>
+            <w:tcW w:w="1250" w:type="pct"/>
+          </w:tcPr>
+          <w:p>
+            <w:pPr>
+              <w:pStyle w:val="Compact"/>
+              <w:rPr>
+                <w:sz w:val="17"/>
+              </w:rPr>
+            </w:pPr>
+            <w:r>
+              <w:rPr>
+                <w:sz w:val="17"/>
+              </w:rPr>
+              <w:t xml:space="preserve">Golden Hill, </w:t>
+            </w:r>
+            <w:r>
+              <w:rPr>
+                <w:b/>
+                <w:bCs/>
+                <w:sz w:val="17"/>
+              </w:rPr>
+              <w:t>San Diego</w:t>
+            </w:r>
+          </w:p>
+        </w:tc>
+        <w:tc>
+          <w:tcPr>
+            <w:tcW w:w="1250" w:type="pct"/>
+          </w:tcPr>
+          <w:p>
+            <w:pPr>
+              <w:pStyle w:val="Compact"/>
+              <w:rPr>
+                <w:sz w:val="17"/>
+              </w:rPr>
+            </w:pPr>
+            <w:r>
+              <w:rPr>
+                <w:sz w:val="17"/>
+              </w:rPr>
+              <w:t>8-storey, 213 units, $107M; partners Qualico US + Tokyu Land US</w:t>
+            </w:r>
+          </w:p>
+        </w:tc>
+        <w:tc>
+          <w:tcPr>
+            <w:tcW w:w="1250" w:type="pct"/>
+          </w:tcPr>
+          <w:p>
+            <w:pPr>
+              <w:pStyle w:val="Compact"/>
+              <w:rPr>
+                <w:sz w:val="17"/>
+              </w:rPr>
+            </w:pPr>
+            <w:r>
+              <w:rPr>
+                <w:sz w:val="17"/>
+              </w:rPr>
+              <w:t xml:space="preserve">Broke ground Apr 2025; delivery Q1 2027 — under construction, so its design team is set: </w:t>
+            </w:r>
+            <w:r>
+              <w:rPr>
+                <w:b/>
+                <w:bCs/>
+                <w:sz w:val="17"/>
+              </w:rPr>
+              <w:t>background intel, not a pursuit</w:t>
             </w:r>
           </w:p>
         </w:tc>
@@ -2582,66 +2700,90 @@
             </w:pPr>
             <w:r>
               <w:rPr>
-                <w:sz w:val="17"/>
-              </w:rPr>
-              <w:t>Jonathan Boyce</w:t>
-            </w:r>
-          </w:p>
-        </w:tc>
-        <w:tc>
-          <w:tcPr>
-            <w:tcW w:w="1250" w:type="pct"/>
-          </w:tcPr>
-          <w:p>
-            <w:pPr>
-              <w:pStyle w:val="Compact"/>
-              <w:rPr>
-                <w:sz w:val="17"/>
-              </w:rPr>
-            </w:pPr>
-            <w:r>
-              <w:rPr>
-                <w:sz w:val="17"/>
-              </w:rPr>
-              <w:t>SVP, British Columbia, Construction (early 2025)</w:t>
-            </w:r>
-          </w:p>
-        </w:tc>
-        <w:tc>
-          <w:tcPr>
-            <w:tcW w:w="1250" w:type="pct"/>
-          </w:tcPr>
-          <w:p>
-            <w:pPr>
-              <w:pStyle w:val="Compact"/>
-              <w:rPr>
-                <w:sz w:val="17"/>
-              </w:rPr>
-            </w:pPr>
-            <w:r>
-              <w:rPr>
-                <w:sz w:val="17"/>
-              </w:rPr>
-              <w:t>Vancouver</w:t>
-            </w:r>
-          </w:p>
-        </w:tc>
-        <w:tc>
-          <w:tcPr>
-            <w:tcW w:w="1250" w:type="pct"/>
-          </w:tcPr>
-          <w:p>
-            <w:pPr>
-              <w:pStyle w:val="Compact"/>
-              <w:rPr>
-                <w:sz w:val="17"/>
-              </w:rPr>
-            </w:pPr>
-            <w:r>
-              <w:rPr>
-                <w:sz w:val="17"/>
-              </w:rPr>
-              <w:t>jonathan.boyce@ledcor.com</w:t>
+                <w:b/>
+                <w:bCs/>
+                <w:sz w:val="17"/>
+              </w:rPr>
+              <w:t>Hercules Bayfront “The Village”</w:t>
+            </w:r>
+          </w:p>
+        </w:tc>
+        <w:tc>
+          <w:tcPr>
+            <w:tcW w:w="1250" w:type="pct"/>
+          </w:tcPr>
+          <w:p>
+            <w:pPr>
+              <w:pStyle w:val="Compact"/>
+              <w:rPr>
+                <w:sz w:val="17"/>
+              </w:rPr>
+            </w:pPr>
+            <w:r>
+              <w:rPr>
+                <w:sz w:val="17"/>
+              </w:rPr>
+              <w:t>Hercules, CA (Bay Area)</w:t>
+            </w:r>
+          </w:p>
+        </w:tc>
+        <w:tc>
+          <w:tcPr>
+            <w:tcW w:w="1250" w:type="pct"/>
+          </w:tcPr>
+          <w:p>
+            <w:pPr>
+              <w:pStyle w:val="Compact"/>
+              <w:rPr>
+                <w:sz w:val="17"/>
+              </w:rPr>
+            </w:pPr>
+            <w:r>
+              <w:rPr>
+                <w:sz w:val="17"/>
+              </w:rPr>
+              <w:t xml:space="preserve">171 townhomes </w:t>
+            </w:r>
+            <w:r>
+              <w:rPr>
+                <w:b/>
+                <w:bCs/>
+                <w:sz w:val="17"/>
+              </w:rPr>
+              <w:t>approved Sept 9, 2025</w:t>
+            </w:r>
+            <w:r>
+              <w:rPr>
+                <w:sz w:val="17"/>
+              </w:rPr>
+              <w:t xml:space="preserve">; plus a 207-key hotel application and ~330 further townhomes in </w:t>
+            </w:r>
+            <w:r>
+              <w:rPr>
+                <w:sz w:val="17"/>
+              </w:rPr>
+              <w:lastRenderedPageBreak/>
+              <w:t>rezoning</w:t>
+            </w:r>
+          </w:p>
+        </w:tc>
+        <w:tc>
+          <w:tcPr>
+            <w:tcW w:w="1250" w:type="pct"/>
+          </w:tcPr>
+          <w:p>
+            <w:pPr>
+              <w:pStyle w:val="Compact"/>
+              <w:rPr>
+                <w:sz w:val="17"/>
+              </w:rPr>
+            </w:pPr>
+            <w:r>
+              <w:rPr>
+                <w:sz w:val="17"/>
+              </w:rPr>
+              <w:lastRenderedPageBreak/>
+              <w:t>Design work ahead — pursuit-shaped</w:t>
             </w:r>
           </w:p>
         </w:tc>
@@ -2664,81 +2806,183 @@
             </w:pPr>
             <w:r>
               <w:rPr>
-                <w:sz w:val="17"/>
-              </w:rPr>
-              <w:t>Aaron Grenier</w:t>
-            </w:r>
-          </w:p>
-        </w:tc>
-        <w:tc>
-          <w:tcPr>
-            <w:tcW w:w="1250" w:type="pct"/>
-          </w:tcPr>
-          <w:p>
-            <w:pPr>
-              <w:pStyle w:val="Compact"/>
-              <w:rPr>
-                <w:sz w:val="17"/>
-              </w:rPr>
-            </w:pPr>
-            <w:r>
-              <w:rPr>
-                <w:sz w:val="17"/>
-              </w:rPr>
-              <w:t>Director, Estimating &amp; Preconstruction</w:t>
-            </w:r>
-          </w:p>
-        </w:tc>
-        <w:tc>
-          <w:tcPr>
-            <w:tcW w:w="1250" w:type="pct"/>
-          </w:tcPr>
-          <w:p>
-            <w:pPr>
-              <w:pStyle w:val="Compact"/>
-              <w:rPr>
-                <w:sz w:val="17"/>
-              </w:rPr>
-            </w:pPr>
-            <w:r>
-              <w:rPr>
-                <w:sz w:val="17"/>
-              </w:rPr>
-              <w:t>Edmonton [I]</w:t>
-            </w:r>
-          </w:p>
-        </w:tc>
-        <w:tc>
-          <w:tcPr>
-            <w:tcW w:w="1250" w:type="pct"/>
-          </w:tcPr>
-          <w:p>
-            <w:pPr>
-              <w:pStyle w:val="Compact"/>
-              <w:rPr>
-                <w:sz w:val="17"/>
-              </w:rPr>
-            </w:pPr>
-            <w:r>
-              <w:rPr>
-                <w:sz w:val="17"/>
-              </w:rPr>
-              <w:t xml:space="preserve">aaron.grenier@ledcor.com </w:t>
-            </w:r>
-            <w:r>
-              <w:rPr>
-                <w:i/>
-                <w:iCs/>
-                <w:sz w:val="17"/>
-              </w:rPr>
-              <w:t>(verified)</w:t>
+                <w:b/>
+                <w:bCs/>
+                <w:sz w:val="17"/>
+              </w:rPr>
+              <w:t>Sunny Creek</w:t>
+            </w:r>
+            <w:r>
+              <w:rPr>
+                <w:sz w:val="17"/>
+              </w:rPr>
+              <w:t xml:space="preserve"> (next phases)</w:t>
+            </w:r>
+          </w:p>
+        </w:tc>
+        <w:tc>
+          <w:tcPr>
+            <w:tcW w:w="1250" w:type="pct"/>
+          </w:tcPr>
+          <w:p>
+            <w:pPr>
+              <w:pStyle w:val="Compact"/>
+              <w:rPr>
+                <w:sz w:val="17"/>
+              </w:rPr>
+            </w:pPr>
+            <w:r>
+              <w:rPr>
+                <w:sz w:val="17"/>
+              </w:rPr>
+              <w:t>Carlsbad, CA</w:t>
+            </w:r>
+          </w:p>
+        </w:tc>
+        <w:tc>
+          <w:tcPr>
+            <w:tcW w:w="1250" w:type="pct"/>
+          </w:tcPr>
+          <w:p>
+            <w:pPr>
+              <w:pStyle w:val="Compact"/>
+              <w:rPr>
+                <w:sz w:val="17"/>
+              </w:rPr>
+            </w:pPr>
+            <w:r>
+              <w:rPr>
+                <w:sz w:val="17"/>
+              </w:rPr>
+              <w:t>~330 townhomes being entitled beyond the built 212 apartments</w:t>
+            </w:r>
+          </w:p>
+        </w:tc>
+        <w:tc>
+          <w:tcPr>
+            <w:tcW w:w="1250" w:type="pct"/>
+          </w:tcPr>
+          <w:p>
+            <w:pPr>
+              <w:pStyle w:val="Compact"/>
+              <w:rPr>
+                <w:sz w:val="17"/>
+              </w:rPr>
+            </w:pPr>
+            <w:r>
+              <w:rPr>
+                <w:sz w:val="17"/>
+              </w:rPr>
+              <w:t>Entitlement — pursuit-shaped</w:t>
             </w:r>
           </w:p>
         </w:tc>
       </w:tr>
+    </w:tbl>
+    <w:p>
+      <w:pPr>
+        <w:pStyle w:val="BodyText"/>
+      </w:pPr>
+      <w:r>
+        <w:t xml:space="preserve">Competitive reality, stated plainly: the only US project with a publicly documented structural engineer is their Long Beach flagship </w:t>
+      </w:r>
+      <w:r>
+        <w:rPr>
+          <w:b/>
+          <w:bCs/>
+        </w:rPr>
+        <w:t>Shoreline Gateway (35-storey) — Englekirk</w:t>
+      </w:r>
+      <w:r>
+        <w:t xml:space="preserve">, a major SoCal firm. On the other six projects the engineer of record wasn’t publicly findable (city permit lookups would resolve it). A KOR pitch in the US is therefore </w:t>
+      </w:r>
+      <w:r>
+        <w:rPr>
+          <w:b/>
+          <w:bCs/>
+        </w:rPr>
+        <w:t>displacing or supplementing an established incumbent, not filling a vacuum</w:t>
+      </w:r>
+      <w:r>
+        <w:t xml:space="preserve"> — but three things travel in KOR’s favour: </w:t>
+      </w:r>
+      <w:r>
+        <w:rPr>
+          <w:b/>
+          <w:bCs/>
+        </w:rPr>
+        <w:t>Andrew Voysey’s EVP Properties mandate is explicitly North-America-wide</w:t>
+      </w:r>
+      <w:r>
+        <w:t xml:space="preserve">; the senior US operating executive is </w:t>
+      </w:r>
+      <w:r>
+        <w:rPr>
+          <w:b/>
+          <w:bCs/>
+        </w:rPr>
+        <w:t>John Santry, SVP US Mainland</w:t>
+      </w:r>
+      <w:r>
+        <w:t xml:space="preserve"> (quoted at the ALARA groundbreaking; confirmed active in 2026 via independent profiles, though he does not appear on ledcor.com’s executive page — noted for accuracy); and KOR’s own ledger already holds a Southern California precedent for the family (the </w:t>
+      </w:r>
+      <w:r>
+        <w:rPr>
+          <w:b/>
+          <w:bCs/>
+        </w:rPr>
+        <w:t>Lede Residence, La Jolla</w:t>
+      </w:r>
+      <w:r>
+        <w:t xml:space="preserve"> </w:t>
+      </w:r>
+      <w:r>
+        <w:t xml:space="preserve">— Section 2). The realistic move is not chasing ALARA (designed and building) but being introduced — through the live Vancouver relationship — before the </w:t>
+      </w:r>
+      <w:r>
+        <w:rPr>
+          <w:b/>
+          <w:bCs/>
+        </w:rPr>
+        <w:t>Hercules and Sunny Creek phases</w:t>
+      </w:r>
+      <w:r>
+        <w:t xml:space="preserve"> pick their design teams.</w:t>
+      </w:r>
+    </w:p>
+    <w:p>
+      <w:pPr>
+        <w:pStyle w:val="Heading2"/>
+      </w:pPr>
+      <w:bookmarkStart w:id="6" w:name="people-verified-only"/>
+      <w:bookmarkEnd w:id="5"/>
+      <w:r>
+        <w:t>6. People (verified only)</w:t>
+      </w:r>
+    </w:p>
+    <w:tbl>
+      <w:tblPr>
+        <w:tblStyle w:val="GridTable4"/>
+        <w:tblW w:w="5000" w:type="pct"/>
+        <w:tblCellMar>
+          <w:top w:w="40" w:type="dxa"/>
+          <w:left w:w="100" w:type="dxa"/>
+          <w:bottom w:w="40" w:type="dxa"/>
+          <w:right w:w="100" w:type="dxa"/>
+        </w:tblCellMar>
+        <w:tblLook w:val="0420" w:firstRow="1" w:lastRow="0" w:firstColumn="0" w:lastColumn="0" w:noHBand="0" w:noVBand="1"/>
+      </w:tblPr>
+      <w:tblGrid>
+        <w:gridCol w:w="2610"/>
+        <w:gridCol w:w="2610"/>
+        <w:gridCol w:w="2610"/>
+        <w:gridCol w:w="2610"/>
+      </w:tblGrid>
       <w:tr>
         <w:trPr>
+          <w:cnfStyle w:val="100000000000" w:firstRow="1" w:lastRow="0" w:firstColumn="0" w:lastColumn="0" w:oddVBand="0" w:evenVBand="0" w:oddHBand="0" w:evenHBand="0" w:firstRowFirstColumn="0" w:firstRowLastColumn="0" w:lastRowFirstColumn="0" w:lastRowLastColumn="0"/>
           <w:cantSplit/>
+          <w:tblHeader/>
         </w:trPr>
         <w:tc>
           <w:tcPr>
@@ -2748,79 +2992,79 @@
             <w:pPr>
               <w:pStyle w:val="Compact"/>
               <w:rPr>
-                <w:sz w:val="17"/>
-              </w:rPr>
-            </w:pPr>
-            <w:r>
-              <w:rPr>
-                <w:sz w:val="17"/>
-              </w:rPr>
-              <w:t>Barry Murphy</w:t>
-            </w:r>
-          </w:p>
-        </w:tc>
-        <w:tc>
-          <w:tcPr>
-            <w:tcW w:w="1250" w:type="pct"/>
-          </w:tcPr>
-          <w:p>
-            <w:pPr>
-              <w:pStyle w:val="Compact"/>
-              <w:rPr>
-                <w:sz w:val="17"/>
-              </w:rPr>
-            </w:pPr>
-            <w:r>
-              <w:rPr>
-                <w:sz w:val="17"/>
-              </w:rPr>
-              <w:t>Director of Business Development</w:t>
-            </w:r>
-          </w:p>
-        </w:tc>
-        <w:tc>
-          <w:tcPr>
-            <w:tcW w:w="1250" w:type="pct"/>
-          </w:tcPr>
-          <w:p>
-            <w:pPr>
-              <w:pStyle w:val="Compact"/>
-              <w:rPr>
-                <w:sz w:val="17"/>
-              </w:rPr>
-            </w:pPr>
-            <w:r>
-              <w:rPr>
-                <w:sz w:val="17"/>
-              </w:rPr>
-              <w:t>—</w:t>
-            </w:r>
-          </w:p>
-        </w:tc>
-        <w:tc>
-          <w:tcPr>
-            <w:tcW w:w="1250" w:type="pct"/>
-          </w:tcPr>
-          <w:p>
-            <w:pPr>
-              <w:pStyle w:val="Compact"/>
-              <w:rPr>
-                <w:sz w:val="17"/>
-              </w:rPr>
-            </w:pPr>
-            <w:r>
-              <w:rPr>
-                <w:sz w:val="17"/>
-              </w:rPr>
-              <w:t xml:space="preserve">barry.murphy@ledcor.com </w:t>
-            </w:r>
-            <w:r>
-              <w:rPr>
-                <w:i/>
-                <w:iCs/>
-                <w:sz w:val="17"/>
-              </w:rPr>
-              <w:t>(verified)</w:t>
+                <w:b w:val="0"/>
+                <w:sz w:val="17"/>
+              </w:rPr>
+            </w:pPr>
+            <w:r>
+              <w:rPr>
+                <w:b w:val="0"/>
+                <w:sz w:val="17"/>
+              </w:rPr>
+              <w:t>Person</w:t>
+            </w:r>
+          </w:p>
+        </w:tc>
+        <w:tc>
+          <w:tcPr>
+            <w:tcW w:w="1250" w:type="pct"/>
+          </w:tcPr>
+          <w:p>
+            <w:pPr>
+              <w:pStyle w:val="Compact"/>
+              <w:rPr>
+                <w:b w:val="0"/>
+                <w:sz w:val="17"/>
+              </w:rPr>
+            </w:pPr>
+            <w:r>
+              <w:rPr>
+                <w:b w:val="0"/>
+                <w:sz w:val="17"/>
+              </w:rPr>
+              <w:t>Title</w:t>
+            </w:r>
+          </w:p>
+        </w:tc>
+        <w:tc>
+          <w:tcPr>
+            <w:tcW w:w="1250" w:type="pct"/>
+          </w:tcPr>
+          <w:p>
+            <w:pPr>
+              <w:pStyle w:val="Compact"/>
+              <w:rPr>
+                <w:b w:val="0"/>
+                <w:sz w:val="17"/>
+              </w:rPr>
+            </w:pPr>
+            <w:r>
+              <w:rPr>
+                <w:b w:val="0"/>
+                <w:sz w:val="17"/>
+              </w:rPr>
+              <w:t>Where</w:t>
+            </w:r>
+          </w:p>
+        </w:tc>
+        <w:tc>
+          <w:tcPr>
+            <w:tcW w:w="1250" w:type="pct"/>
+          </w:tcPr>
+          <w:p>
+            <w:pPr>
+              <w:pStyle w:val="Compact"/>
+              <w:rPr>
+                <w:b w:val="0"/>
+                <w:sz w:val="17"/>
+              </w:rPr>
+            </w:pPr>
+            <w:r>
+              <w:rPr>
+                <w:b w:val="0"/>
+                <w:sz w:val="17"/>
+              </w:rPr>
+              <w:t>Contact</w:t>
             </w:r>
           </w:p>
         </w:tc>
@@ -2845,64 +3089,64 @@
               <w:rPr>
                 <w:sz w:val="17"/>
               </w:rPr>
-              <w:t>Jeff Thompson</w:t>
-            </w:r>
-          </w:p>
-        </w:tc>
-        <w:tc>
-          <w:tcPr>
-            <w:tcW w:w="1250" w:type="pct"/>
-          </w:tcPr>
-          <w:p>
-            <w:pPr>
-              <w:pStyle w:val="Compact"/>
-              <w:rPr>
-                <w:sz w:val="17"/>
-              </w:rPr>
-            </w:pPr>
-            <w:r>
-              <w:rPr>
-                <w:sz w:val="17"/>
-              </w:rPr>
-              <w:t>SVP, Corporate Development &amp; National Accounts, Construction</w:t>
-            </w:r>
-          </w:p>
-        </w:tc>
-        <w:tc>
-          <w:tcPr>
-            <w:tcW w:w="1250" w:type="pct"/>
-          </w:tcPr>
-          <w:p>
-            <w:pPr>
-              <w:pStyle w:val="Compact"/>
-              <w:rPr>
-                <w:sz w:val="17"/>
-              </w:rPr>
-            </w:pPr>
-            <w:r>
-              <w:rPr>
-                <w:sz w:val="17"/>
-              </w:rPr>
-              <w:t>—</w:t>
-            </w:r>
-          </w:p>
-        </w:tc>
-        <w:tc>
-          <w:tcPr>
-            <w:tcW w:w="1250" w:type="pct"/>
-          </w:tcPr>
-          <w:p>
-            <w:pPr>
-              <w:pStyle w:val="Compact"/>
-              <w:rPr>
-                <w:sz w:val="17"/>
-              </w:rPr>
-            </w:pPr>
-            <w:r>
-              <w:rPr>
-                <w:sz w:val="17"/>
-              </w:rPr>
-              <w:t xml:space="preserve">jeff.thompson@ledcor.com </w:t>
+              <w:t>Russell Zirnhelt</w:t>
+            </w:r>
+          </w:p>
+        </w:tc>
+        <w:tc>
+          <w:tcPr>
+            <w:tcW w:w="1250" w:type="pct"/>
+          </w:tcPr>
+          <w:p>
+            <w:pPr>
+              <w:pStyle w:val="Compact"/>
+              <w:rPr>
+                <w:sz w:val="17"/>
+              </w:rPr>
+            </w:pPr>
+            <w:r>
+              <w:rPr>
+                <w:sz w:val="17"/>
+              </w:rPr>
+              <w:t>EVP, Ledcor Construction Ltd (buildings, Canada-wide)</w:t>
+            </w:r>
+          </w:p>
+        </w:tc>
+        <w:tc>
+          <w:tcPr>
+            <w:tcW w:w="1250" w:type="pct"/>
+          </w:tcPr>
+          <w:p>
+            <w:pPr>
+              <w:pStyle w:val="Compact"/>
+              <w:rPr>
+                <w:sz w:val="17"/>
+              </w:rPr>
+            </w:pPr>
+            <w:r>
+              <w:rPr>
+                <w:sz w:val="17"/>
+              </w:rPr>
+              <w:t>Vancouver</w:t>
+            </w:r>
+          </w:p>
+        </w:tc>
+        <w:tc>
+          <w:tcPr>
+            <w:tcW w:w="1250" w:type="pct"/>
+          </w:tcPr>
+          <w:p>
+            <w:pPr>
+              <w:pStyle w:val="Compact"/>
+              <w:rPr>
+                <w:sz w:val="17"/>
+              </w:rPr>
+            </w:pPr>
+            <w:r>
+              <w:rPr>
+                <w:sz w:val="17"/>
+              </w:rPr>
+              <w:t xml:space="preserve">russell.zirnhelt@ledcor.com </w:t>
             </w:r>
             <w:r>
               <w:rPr>
@@ -2910,7 +3154,7 @@
                 <w:iCs/>
                 <w:sz w:val="17"/>
               </w:rPr>
-              <w:t>(verified)</w:t>
+              <w:t>(inferred pattern, unconfirmed)</w:t>
             </w:r>
           </w:p>
         </w:tc>
@@ -2934,26 +3178,26 @@
               <w:rPr>
                 <w:sz w:val="17"/>
               </w:rPr>
-              <w:t>Lorne Wolinsky</w:t>
-            </w:r>
-          </w:p>
-        </w:tc>
-        <w:tc>
-          <w:tcPr>
-            <w:tcW w:w="1250" w:type="pct"/>
-          </w:tcPr>
-          <w:p>
-            <w:pPr>
-              <w:pStyle w:val="Compact"/>
-              <w:rPr>
-                <w:sz w:val="17"/>
-              </w:rPr>
-            </w:pPr>
-            <w:r>
-              <w:rPr>
-                <w:sz w:val="17"/>
-              </w:rPr>
-              <w:t>VP, Development (Ledcor Properties)</w:t>
+              <w:t>Jonathan Boyce</w:t>
+            </w:r>
+          </w:p>
+        </w:tc>
+        <w:tc>
+          <w:tcPr>
+            <w:tcW w:w="1250" w:type="pct"/>
+          </w:tcPr>
+          <w:p>
+            <w:pPr>
+              <w:pStyle w:val="Compact"/>
+              <w:rPr>
+                <w:sz w:val="17"/>
+              </w:rPr>
+            </w:pPr>
+            <w:r>
+              <w:rPr>
+                <w:sz w:val="17"/>
+              </w:rPr>
+              <w:t>SVP, British Columbia, Construction (early 2025)</w:t>
             </w:r>
           </w:p>
         </w:tc>
@@ -2991,7 +3235,7 @@
               <w:rPr>
                 <w:sz w:val="17"/>
               </w:rPr>
-              <w:t>via KOR’s active LPI projects</w:t>
+              <w:t>jonathan.boyce@ledcor.com</w:t>
             </w:r>
           </w:p>
         </w:tc>
@@ -3016,64 +3260,72 @@
               <w:rPr>
                 <w:sz w:val="17"/>
               </w:rPr>
-              <w:t>Andrew Voysey</w:t>
-            </w:r>
-          </w:p>
-        </w:tc>
-        <w:tc>
-          <w:tcPr>
-            <w:tcW w:w="1250" w:type="pct"/>
-          </w:tcPr>
-          <w:p>
-            <w:pPr>
-              <w:pStyle w:val="Compact"/>
-              <w:rPr>
-                <w:sz w:val="17"/>
-              </w:rPr>
-            </w:pPr>
-            <w:r>
-              <w:rPr>
-                <w:sz w:val="17"/>
-              </w:rPr>
-              <w:t>EVP, Ledcor Properties (top Properties seat on current rosters)</w:t>
-            </w:r>
-          </w:p>
-        </w:tc>
-        <w:tc>
-          <w:tcPr>
-            <w:tcW w:w="1250" w:type="pct"/>
-          </w:tcPr>
-          <w:p>
-            <w:pPr>
-              <w:pStyle w:val="Compact"/>
-              <w:rPr>
-                <w:sz w:val="17"/>
-              </w:rPr>
-            </w:pPr>
-            <w:r>
-              <w:rPr>
-                <w:sz w:val="17"/>
-              </w:rPr>
-              <w:t>Vancouver</w:t>
-            </w:r>
-          </w:p>
-        </w:tc>
-        <w:tc>
-          <w:tcPr>
-            <w:tcW w:w="1250" w:type="pct"/>
-          </w:tcPr>
-          <w:p>
-            <w:pPr>
-              <w:pStyle w:val="Compact"/>
-              <w:rPr>
-                <w:sz w:val="17"/>
-              </w:rPr>
-            </w:pPr>
-            <w:r>
-              <w:rPr>
-                <w:sz w:val="17"/>
-              </w:rPr>
-              <w:t>via LPI</w:t>
+              <w:t>Aaron Grenier</w:t>
+            </w:r>
+          </w:p>
+        </w:tc>
+        <w:tc>
+          <w:tcPr>
+            <w:tcW w:w="1250" w:type="pct"/>
+          </w:tcPr>
+          <w:p>
+            <w:pPr>
+              <w:pStyle w:val="Compact"/>
+              <w:rPr>
+                <w:sz w:val="17"/>
+              </w:rPr>
+            </w:pPr>
+            <w:r>
+              <w:rPr>
+                <w:sz w:val="17"/>
+              </w:rPr>
+              <w:t>Director, Estimating &amp; Preconstruction</w:t>
+            </w:r>
+          </w:p>
+        </w:tc>
+        <w:tc>
+          <w:tcPr>
+            <w:tcW w:w="1250" w:type="pct"/>
+          </w:tcPr>
+          <w:p>
+            <w:pPr>
+              <w:pStyle w:val="Compact"/>
+              <w:rPr>
+                <w:sz w:val="17"/>
+              </w:rPr>
+            </w:pPr>
+            <w:r>
+              <w:rPr>
+                <w:sz w:val="17"/>
+              </w:rPr>
+              <w:t>Edmonton [I]</w:t>
+            </w:r>
+          </w:p>
+        </w:tc>
+        <w:tc>
+          <w:tcPr>
+            <w:tcW w:w="1250" w:type="pct"/>
+          </w:tcPr>
+          <w:p>
+            <w:pPr>
+              <w:pStyle w:val="Compact"/>
+              <w:rPr>
+                <w:sz w:val="17"/>
+              </w:rPr>
+            </w:pPr>
+            <w:r>
+              <w:rPr>
+                <w:sz w:val="17"/>
+              </w:rPr>
+              <w:t xml:space="preserve">aaron.grenier@ledcor.com </w:t>
+            </w:r>
+            <w:r>
+              <w:rPr>
+                <w:i/>
+                <w:iCs/>
+                <w:sz w:val="17"/>
+              </w:rPr>
+              <w:t>(verified)</w:t>
             </w:r>
           </w:p>
         </w:tc>
@@ -3097,64 +3349,64 @@
               <w:rPr>
                 <w:sz w:val="17"/>
               </w:rPr>
-              <w:t>Jeff Watt</w:t>
-            </w:r>
-          </w:p>
-        </w:tc>
-        <w:tc>
-          <w:tcPr>
-            <w:tcW w:w="1250" w:type="pct"/>
-          </w:tcPr>
-          <w:p>
-            <w:pPr>
-              <w:pStyle w:val="Compact"/>
-              <w:rPr>
-                <w:sz w:val="17"/>
-              </w:rPr>
-            </w:pPr>
-            <w:r>
-              <w:rPr>
-                <w:sz w:val="17"/>
-              </w:rPr>
-              <w:t>President, Ledcor Group of Companies (Jan 2025)</w:t>
-            </w:r>
-          </w:p>
-        </w:tc>
-        <w:tc>
-          <w:tcPr>
-            <w:tcW w:w="1250" w:type="pct"/>
-          </w:tcPr>
-          <w:p>
-            <w:pPr>
-              <w:pStyle w:val="Compact"/>
-              <w:rPr>
-                <w:sz w:val="17"/>
-              </w:rPr>
-            </w:pPr>
-            <w:r>
-              <w:rPr>
-                <w:sz w:val="17"/>
-              </w:rPr>
-              <w:t>Vancouver</w:t>
-            </w:r>
-          </w:p>
-        </w:tc>
-        <w:tc>
-          <w:tcPr>
-            <w:tcW w:w="1250" w:type="pct"/>
-          </w:tcPr>
-          <w:p>
-            <w:pPr>
-              <w:pStyle w:val="Compact"/>
-              <w:rPr>
-                <w:sz w:val="17"/>
-              </w:rPr>
-            </w:pPr>
-            <w:r>
-              <w:rPr>
-                <w:sz w:val="17"/>
-              </w:rPr>
-              <w:t xml:space="preserve">jeff.watt@ledcor.com </w:t>
+              <w:t>Barry Murphy</w:t>
+            </w:r>
+          </w:p>
+        </w:tc>
+        <w:tc>
+          <w:tcPr>
+            <w:tcW w:w="1250" w:type="pct"/>
+          </w:tcPr>
+          <w:p>
+            <w:pPr>
+              <w:pStyle w:val="Compact"/>
+              <w:rPr>
+                <w:sz w:val="17"/>
+              </w:rPr>
+            </w:pPr>
+            <w:r>
+              <w:rPr>
+                <w:sz w:val="17"/>
+              </w:rPr>
+              <w:t>Director of Business Development</w:t>
+            </w:r>
+          </w:p>
+        </w:tc>
+        <w:tc>
+          <w:tcPr>
+            <w:tcW w:w="1250" w:type="pct"/>
+          </w:tcPr>
+          <w:p>
+            <w:pPr>
+              <w:pStyle w:val="Compact"/>
+              <w:rPr>
+                <w:sz w:val="17"/>
+              </w:rPr>
+            </w:pPr>
+            <w:r>
+              <w:rPr>
+                <w:sz w:val="17"/>
+              </w:rPr>
+              <w:t>—</w:t>
+            </w:r>
+          </w:p>
+        </w:tc>
+        <w:tc>
+          <w:tcPr>
+            <w:tcW w:w="1250" w:type="pct"/>
+          </w:tcPr>
+          <w:p>
+            <w:pPr>
+              <w:pStyle w:val="Compact"/>
+              <w:rPr>
+                <w:sz w:val="17"/>
+              </w:rPr>
+            </w:pPr>
+            <w:r>
+              <w:rPr>
+                <w:sz w:val="17"/>
+              </w:rPr>
+              <w:t xml:space="preserve">barry.murphy@ledcor.com </w:t>
             </w:r>
             <w:r>
               <w:rPr>
@@ -3162,7 +3414,7 @@
                 <w:iCs/>
                 <w:sz w:val="17"/>
               </w:rPr>
-              <w:t>(inferred pattern, unconfirmed)</w:t>
+              <w:t>(verified)</w:t>
             </w:r>
           </w:p>
         </w:tc>
@@ -3187,6 +3439,429 @@
               <w:rPr>
                 <w:sz w:val="17"/>
               </w:rPr>
+              <w:t>Jeff Thompson</w:t>
+            </w:r>
+          </w:p>
+        </w:tc>
+        <w:tc>
+          <w:tcPr>
+            <w:tcW w:w="1250" w:type="pct"/>
+          </w:tcPr>
+          <w:p>
+            <w:pPr>
+              <w:pStyle w:val="Compact"/>
+              <w:rPr>
+                <w:sz w:val="17"/>
+              </w:rPr>
+            </w:pPr>
+            <w:r>
+              <w:rPr>
+                <w:sz w:val="17"/>
+              </w:rPr>
+              <w:t>SVP, Corporate Development &amp; National Accounts, Construction</w:t>
+            </w:r>
+          </w:p>
+        </w:tc>
+        <w:tc>
+          <w:tcPr>
+            <w:tcW w:w="1250" w:type="pct"/>
+          </w:tcPr>
+          <w:p>
+            <w:pPr>
+              <w:pStyle w:val="Compact"/>
+              <w:rPr>
+                <w:sz w:val="17"/>
+              </w:rPr>
+            </w:pPr>
+            <w:r>
+              <w:rPr>
+                <w:sz w:val="17"/>
+              </w:rPr>
+              <w:t>—</w:t>
+            </w:r>
+          </w:p>
+        </w:tc>
+        <w:tc>
+          <w:tcPr>
+            <w:tcW w:w="1250" w:type="pct"/>
+          </w:tcPr>
+          <w:p>
+            <w:pPr>
+              <w:pStyle w:val="Compact"/>
+              <w:rPr>
+                <w:sz w:val="17"/>
+              </w:rPr>
+            </w:pPr>
+            <w:r>
+              <w:rPr>
+                <w:sz w:val="17"/>
+              </w:rPr>
+              <w:t xml:space="preserve">jeff.thompson@ledcor.com </w:t>
+            </w:r>
+            <w:r>
+              <w:rPr>
+                <w:i/>
+                <w:iCs/>
+                <w:sz w:val="17"/>
+              </w:rPr>
+              <w:t>(verified)</w:t>
+            </w:r>
+          </w:p>
+        </w:tc>
+      </w:tr>
+      <w:tr>
+        <w:trPr>
+          <w:cantSplit/>
+        </w:trPr>
+        <w:tc>
+          <w:tcPr>
+            <w:tcW w:w="1250" w:type="pct"/>
+          </w:tcPr>
+          <w:p>
+            <w:pPr>
+              <w:pStyle w:val="Compact"/>
+              <w:rPr>
+                <w:sz w:val="17"/>
+              </w:rPr>
+            </w:pPr>
+            <w:r>
+              <w:rPr>
+                <w:sz w:val="17"/>
+              </w:rPr>
+              <w:t>Lorne Wolinsky</w:t>
+            </w:r>
+          </w:p>
+        </w:tc>
+        <w:tc>
+          <w:tcPr>
+            <w:tcW w:w="1250" w:type="pct"/>
+          </w:tcPr>
+          <w:p>
+            <w:pPr>
+              <w:pStyle w:val="Compact"/>
+              <w:rPr>
+                <w:sz w:val="17"/>
+              </w:rPr>
+            </w:pPr>
+            <w:r>
+              <w:rPr>
+                <w:sz w:val="17"/>
+              </w:rPr>
+              <w:t>VP, Development (Ledcor Properties)</w:t>
+            </w:r>
+          </w:p>
+        </w:tc>
+        <w:tc>
+          <w:tcPr>
+            <w:tcW w:w="1250" w:type="pct"/>
+          </w:tcPr>
+          <w:p>
+            <w:pPr>
+              <w:pStyle w:val="Compact"/>
+              <w:rPr>
+                <w:sz w:val="17"/>
+              </w:rPr>
+            </w:pPr>
+            <w:r>
+              <w:rPr>
+                <w:sz w:val="17"/>
+              </w:rPr>
+              <w:t>Vancouver</w:t>
+            </w:r>
+          </w:p>
+        </w:tc>
+        <w:tc>
+          <w:tcPr>
+            <w:tcW w:w="1250" w:type="pct"/>
+          </w:tcPr>
+          <w:p>
+            <w:pPr>
+              <w:pStyle w:val="Compact"/>
+              <w:rPr>
+                <w:sz w:val="17"/>
+              </w:rPr>
+            </w:pPr>
+            <w:r>
+              <w:rPr>
+                <w:sz w:val="17"/>
+              </w:rPr>
+              <w:t>via KOR’s active LPI projects</w:t>
+            </w:r>
+          </w:p>
+        </w:tc>
+      </w:tr>
+      <w:tr>
+        <w:trPr>
+          <w:cnfStyle w:val="000000100000" w:firstRow="0" w:lastRow="0" w:firstColumn="0" w:lastColumn="0" w:oddVBand="0" w:evenVBand="0" w:oddHBand="1" w:evenHBand="0" w:firstRowFirstColumn="0" w:firstRowLastColumn="0" w:lastRowFirstColumn="0" w:lastRowLastColumn="0"/>
+          <w:cantSplit/>
+        </w:trPr>
+        <w:tc>
+          <w:tcPr>
+            <w:tcW w:w="1250" w:type="pct"/>
+          </w:tcPr>
+          <w:p>
+            <w:pPr>
+              <w:pStyle w:val="Compact"/>
+              <w:rPr>
+                <w:sz w:val="17"/>
+              </w:rPr>
+            </w:pPr>
+            <w:r>
+              <w:rPr>
+                <w:sz w:val="17"/>
+              </w:rPr>
+              <w:t>Andrew Voysey</w:t>
+            </w:r>
+          </w:p>
+        </w:tc>
+        <w:tc>
+          <w:tcPr>
+            <w:tcW w:w="1250" w:type="pct"/>
+          </w:tcPr>
+          <w:p>
+            <w:pPr>
+              <w:pStyle w:val="Compact"/>
+              <w:rPr>
+                <w:sz w:val="17"/>
+              </w:rPr>
+            </w:pPr>
+            <w:r>
+              <w:rPr>
+                <w:sz w:val="17"/>
+              </w:rPr>
+              <w:t>EVP, Ledcor Properties (top Properties seat on current rosters; mandate is North-America-wide)</w:t>
+            </w:r>
+          </w:p>
+        </w:tc>
+        <w:tc>
+          <w:tcPr>
+            <w:tcW w:w="1250" w:type="pct"/>
+          </w:tcPr>
+          <w:p>
+            <w:pPr>
+              <w:pStyle w:val="Compact"/>
+              <w:rPr>
+                <w:sz w:val="17"/>
+              </w:rPr>
+            </w:pPr>
+            <w:r>
+              <w:rPr>
+                <w:sz w:val="17"/>
+              </w:rPr>
+              <w:t>Vancouver</w:t>
+            </w:r>
+          </w:p>
+        </w:tc>
+        <w:tc>
+          <w:tcPr>
+            <w:tcW w:w="1250" w:type="pct"/>
+          </w:tcPr>
+          <w:p>
+            <w:pPr>
+              <w:pStyle w:val="Compact"/>
+              <w:rPr>
+                <w:sz w:val="17"/>
+              </w:rPr>
+            </w:pPr>
+            <w:r>
+              <w:rPr>
+                <w:sz w:val="17"/>
+              </w:rPr>
+              <w:t>via LPI</w:t>
+            </w:r>
+          </w:p>
+        </w:tc>
+      </w:tr>
+      <w:tr>
+        <w:trPr>
+          <w:cantSplit/>
+        </w:trPr>
+        <w:tc>
+          <w:tcPr>
+            <w:tcW w:w="1250" w:type="pct"/>
+          </w:tcPr>
+          <w:p>
+            <w:pPr>
+              <w:pStyle w:val="Compact"/>
+              <w:rPr>
+                <w:sz w:val="17"/>
+              </w:rPr>
+            </w:pPr>
+            <w:r>
+              <w:rPr>
+                <w:sz w:val="17"/>
+              </w:rPr>
+              <w:t>John Santry</w:t>
+            </w:r>
+          </w:p>
+        </w:tc>
+        <w:tc>
+          <w:tcPr>
+            <w:tcW w:w="1250" w:type="pct"/>
+          </w:tcPr>
+          <w:p>
+            <w:pPr>
+              <w:pStyle w:val="Compact"/>
+              <w:rPr>
+                <w:sz w:val="17"/>
+              </w:rPr>
+            </w:pPr>
+            <w:r>
+              <w:rPr>
+                <w:sz w:val="17"/>
+              </w:rPr>
+              <w:t>SVP, US Mainland, Ledcor Properties (active 2026 per independent profiles + ALARA press; not on ledcor.com’s exec page)</w:t>
+            </w:r>
+          </w:p>
+        </w:tc>
+        <w:tc>
+          <w:tcPr>
+            <w:tcW w:w="1250" w:type="pct"/>
+          </w:tcPr>
+          <w:p>
+            <w:pPr>
+              <w:pStyle w:val="Compact"/>
+              <w:rPr>
+                <w:sz w:val="17"/>
+              </w:rPr>
+            </w:pPr>
+            <w:r>
+              <w:rPr>
+                <w:sz w:val="17"/>
+              </w:rPr>
+              <w:t>Irvine, CA</w:t>
+            </w:r>
+          </w:p>
+        </w:tc>
+        <w:tc>
+          <w:tcPr>
+            <w:tcW w:w="1250" w:type="pct"/>
+          </w:tcPr>
+          <w:p>
+            <w:pPr>
+              <w:pStyle w:val="Compact"/>
+              <w:rPr>
+                <w:sz w:val="17"/>
+              </w:rPr>
+            </w:pPr>
+            <w:r>
+              <w:rPr>
+                <w:sz w:val="17"/>
+              </w:rPr>
+              <w:t>via the LPI relationship / US intro</w:t>
+            </w:r>
+          </w:p>
+        </w:tc>
+      </w:tr>
+      <w:tr>
+        <w:trPr>
+          <w:cnfStyle w:val="000000100000" w:firstRow="0" w:lastRow="0" w:firstColumn="0" w:lastColumn="0" w:oddVBand="0" w:evenVBand="0" w:oddHBand="1" w:evenHBand="0" w:firstRowFirstColumn="0" w:firstRowLastColumn="0" w:lastRowFirstColumn="0" w:lastRowLastColumn="0"/>
+          <w:cantSplit/>
+        </w:trPr>
+        <w:tc>
+          <w:tcPr>
+            <w:tcW w:w="1250" w:type="pct"/>
+          </w:tcPr>
+          <w:p>
+            <w:pPr>
+              <w:pStyle w:val="Compact"/>
+              <w:rPr>
+                <w:sz w:val="17"/>
+              </w:rPr>
+            </w:pPr>
+            <w:r>
+              <w:rPr>
+                <w:sz w:val="17"/>
+              </w:rPr>
+              <w:t>Jeff Watt</w:t>
+            </w:r>
+          </w:p>
+        </w:tc>
+        <w:tc>
+          <w:tcPr>
+            <w:tcW w:w="1250" w:type="pct"/>
+          </w:tcPr>
+          <w:p>
+            <w:pPr>
+              <w:pStyle w:val="Compact"/>
+              <w:rPr>
+                <w:sz w:val="17"/>
+              </w:rPr>
+            </w:pPr>
+            <w:r>
+              <w:rPr>
+                <w:sz w:val="17"/>
+              </w:rPr>
+              <w:t>President, Ledcor Group of Companies (Jan 2025)</w:t>
+            </w:r>
+          </w:p>
+        </w:tc>
+        <w:tc>
+          <w:tcPr>
+            <w:tcW w:w="1250" w:type="pct"/>
+          </w:tcPr>
+          <w:p>
+            <w:pPr>
+              <w:pStyle w:val="Compact"/>
+              <w:rPr>
+                <w:sz w:val="17"/>
+              </w:rPr>
+            </w:pPr>
+            <w:r>
+              <w:rPr>
+                <w:sz w:val="17"/>
+              </w:rPr>
+              <w:t>Vancouver</w:t>
+            </w:r>
+          </w:p>
+        </w:tc>
+        <w:tc>
+          <w:tcPr>
+            <w:tcW w:w="1250" w:type="pct"/>
+          </w:tcPr>
+          <w:p>
+            <w:pPr>
+              <w:pStyle w:val="Compact"/>
+              <w:rPr>
+                <w:sz w:val="17"/>
+              </w:rPr>
+            </w:pPr>
+            <w:r>
+              <w:rPr>
+                <w:sz w:val="17"/>
+              </w:rPr>
+              <w:t xml:space="preserve">jeff.watt@ledcor.com </w:t>
+            </w:r>
+            <w:r>
+              <w:rPr>
+                <w:i/>
+                <w:iCs/>
+                <w:sz w:val="17"/>
+              </w:rPr>
+              <w:t>(inferred pattern, unconfirmed)</w:t>
+            </w:r>
+          </w:p>
+        </w:tc>
+      </w:tr>
+      <w:tr>
+        <w:trPr>
+          <w:cantSplit/>
+        </w:trPr>
+        <w:tc>
+          <w:tcPr>
+            <w:tcW w:w="1250" w:type="pct"/>
+          </w:tcPr>
+          <w:p>
+            <w:pPr>
+              <w:pStyle w:val="Compact"/>
+              <w:rPr>
+                <w:sz w:val="17"/>
+              </w:rPr>
+            </w:pPr>
+            <w:r>
+              <w:rPr>
+                <w:sz w:val="17"/>
+              </w:rPr>
               <w:t>Dave Lede</w:t>
             </w:r>
           </w:p>
@@ -3262,10 +3937,7 @@
         <w:t>Dropped after verification (do not cite):</w:t>
       </w:r>
       <w:r>
-        <w:t xml:space="preserve"> </w:t>
-      </w:r>
-      <w:r>
-        <w:t xml:space="preserve">Billy O’Donovan (likely departed — his LinkedIn signals another firm), “Mike Roper, VP Northern Alberta” (aggregator-only, no primary source), and </w:t>
+        <w:t xml:space="preserve"> Billy O’Donovan (likely departed — his LinkedIn signals another firm), “Mike Roper, VP Northern Alberta” (aggregator-only, no primary source), and </w:t>
       </w:r>
       <w:r>
         <w:rPr>
@@ -3313,7 +3985,6 @@
           <w:b/>
           <w:bCs/>
         </w:rPr>
-        <w:lastRenderedPageBreak/>
         <w:t>CIRB (two orders):</w:t>
       </w:r>
       <w:r>
@@ -3438,7 +4109,7 @@
         <w:t xml:space="preserve"> </w:t>
       </w:r>
       <w:r>
-        <w:t>WorkSafeBC and US OSHA penalty databases (require manual queries); BC Bid / Alberta Purchasing Connection postings (not indexable — a live pursuit could exist there without appearing in this document); confirmation of who leads Ledcor’s Edmonton buildings office.</w:t>
+        <w:t>WorkSafeBC and US OSHA penalty databases (require manual queries); BC Bid / Alberta Purchasing Connection postings (not indexable — a live pursuit could exist there without appearing in this document); confirmation of who leads Ledcor’s Edmonton buildings office; the structural engineer of record on six of the seven US projects (city permit-portal lookups would resolve); the US portfolio’s total value (the “8 projects / $2B+” figure dates from a 2020 release — treat as directional only).</w:t>
       </w:r>
     </w:p>
     <w:p>
@@ -3467,10 +4138,7 @@
         <w:t>Now:</w:t>
       </w:r>
       <w:r>
-        <w:t xml:space="preserve"> </w:t>
-      </w:r>
-      <w:r>
-        <w:t>follow up all three pending proposals (E 10th $175k; Kingsway-match $125k; Steveston $61k) — three approvals since November mean the program is converting toward design over the coming 12–24 months. First, resolve in Deltek whether the two “Trinity E 10th” records are one pursuit.</w:t>
+        <w:t xml:space="preserve"> follow up all three pending proposals (E 10th $175k; Kingsway-match $125k; Steveston $61k) — three approvals since November mean the program is converting toward design over the coming 12–24 months. (The Trinity question is resolved: Deltek carries the two E 10th records as separate projects, 20159 and 20476 — confirm the scope split with the PM.)</w:t>
       </w:r>
     </w:p>
     <w:p>
@@ -3489,7 +4157,10 @@
         <w:t>July:</w:t>
       </w:r>
       <w:r>
-        <w:t xml:space="preserve"> ask Wolinsky/LPI for a program-level conversation — “cover all four Telus Living projects plus 730 Raymur follow-on” — from inside the active relationship.</w:t>
+        <w:t xml:space="preserve"> ask Wolinsky/LPI for a program-level conversation — “cover all four Telus Living projects plus 730 Raymur follow-on” </w:t>
+      </w:r>
+      <w:r>
+        <w:t>— from inside the active relationship.</w:t>
       </w:r>
     </w:p>
     <w:p>
@@ -3508,10 +4179,7 @@
         <w:t>July–August:</w:t>
       </w:r>
       <w:r>
-        <w:t xml:space="preserve"> </w:t>
-      </w:r>
-      <w:r>
-        <w:t>introduce KOR to Ledcor Construction’s precon/BD (Grenier, Murphy; Boyce at the relationship level) — goal: be on the call list for the next design-build pursuit’s structural seat. Reference the live LPI work as the family credential.</w:t>
+        <w:t xml:space="preserve"> introduce KOR to Ledcor Construction’s precon/BD (Grenier, Murphy; Boyce at the relationship level) — goal: be on the call list for the next design-build pursuit’s structural seat. Reference the live LPI work as the family credential.</w:t>
       </w:r>
     </w:p>
     <w:p>
@@ -3546,18 +4214,50 @@
           <w:b/>
           <w:bCs/>
         </w:rPr>
-        <w:t>Ongoing:</w:t>
+        <w:t>Q3 (US):</w:t>
       </w:r>
       <w:r>
         <w:t xml:space="preserve"> </w:t>
       </w:r>
       <w:r>
-        <w:t>progress the two Alberta CRM engagements already in KOR’s system; verify Ledcor’s Edmonton buildings leadership before any AB outreach.</w:t>
+        <w:t xml:space="preserve">brief KOR’s San Diego office on Ledcor Development LP — ALARA delivers Q1 2027 (background), and the pursuit-shaped work is the </w:t>
+      </w:r>
+      <w:r>
+        <w:rPr>
+          <w:b/>
+          <w:bCs/>
+        </w:rPr>
+        <w:t>Hercules “Village” townhomes (approved Sept 2025) and the Sunny Creek Carlsbad phases</w:t>
+      </w:r>
+      <w:r>
+        <w:t>. The introduction can travel through the live Vancouver relationship: Voysey’s mandate covers North America, and KOR’s ledger already holds the Lede Residence, La Jolla. Target: John Santry (SVP, US Mainland, Irvine).</w:t>
       </w:r>
     </w:p>
     <w:p>
-      <w:r>
-        <w:pict w14:anchorId="58BE9804">
+      <w:pPr>
+        <w:pStyle w:val="Compact"/>
+        <w:numPr>
+          <w:ilvl w:val="0"/>
+          <w:numId w:val="6"/>
+        </w:numPr>
+      </w:pPr>
+      <w:r>
+        <w:rPr>
+          <w:b/>
+          <w:bCs/>
+        </w:rPr>
+        <w:t>Ongoing:</w:t>
+      </w:r>
+      <w:r>
+        <w:t xml:space="preserve"> </w:t>
+      </w:r>
+      <w:r>
+        <w:t>progress the two Alberta CRM engagements already in KOR’s system; verify Ledcor’s Edmonton buildings leadership before any AB outreach.</w:t>
+      </w:r>
+    </w:p>
+    <w:p>
+      <w:r>
+        <w:pict w14:anchorId="104E3AE7">
           <v:rect id="_x0000_i1026" style="width:0;height:1.5pt" o:hralign="center" o:hrstd="t" o:hr="t"/>
         </w:pict>
       </w:r>
@@ -3577,10 +4277,13 @@
         <w:pStyle w:val="FirstParagraph"/>
       </w:pPr>
       <w:r>
-        <w:t>ledcor.com (executive profiles, locations, newsroom, project pages) · ledcordevelopment.com (team) · news.gov.bc.ca (BC Children’s DB selection; BCIT opening) · fastepp.com (BC Children’s + BCIT structural credits) · equilibrium-eq.com (Northern Lights College) · facilities.ubc.ca (Brock Commons — Urban One) · council.vancouver.ca (E 10th May 5 2026 + Chester Nov 13 2025 approvals) · shapeyourcity.ca + Daily Hive (3696 Kingsway) · CityHallWatch (Arbutus Walk approval) · surrey.ca + Daily Hive (City Centre A</w:t>
-      </w:r>
-      <w:r>
-        <w:t>rena procurement) · ellisdon.com / bird.ca / pcl.com (healthcare counter-record) · canada.constructconnect.com (CIRB ruling; James Cowan) · CanLII via Singleton Reynolds (2025 ONSC 5100) · burnaby.ca (James Cowan) · KOR Deltek/CRM (pursuit and engagement records; check statuses AP/STC directly).</w:t>
+        <w:t>ledcor.com (executive profiles, locations, newsroom incl. Patterson-2020 and davisReed-2019 releases, US pages, project galleries) · ledcordevelopment.com (team; Sunny Creek project page) · businesswire.com (ALARA groundbreaking, Apr 2025) · pacific-structures.com + buildgc.com (Shoreline Gateway design team incl. Englekirk) · Hercules, CA council coverage (The Village approval, Sept 2025) · news.gov.bc.ca (BC Children’s DB selection; BCIT opening) · fastepp.com (BC Children’s + BCIT structural credits) · e</w:t>
+      </w:r>
+      <w:r>
+        <w:t>quilibrium-eq.com (Northern Lights College) · facilities.ubc.ca (Brock Commons — Urban One) · council.vancouver.ca (E 10th May 5 2026 + Chester Nov 13 2025 approvals) · shapeyourcity.ca + Daily Hive (3696 Kingsway) · CityHallWatch (Arbutus Walk approval) · surrey.ca + Daily Hive (City Centre Arena procurement) · ellisdon.com / bird.ca / pcl.com (healthcare counter-record) · canada.constructconnect.com (CIRB ruling; James Cowan) · CanLII via Singleton Reynolds (2025 ONSC 5100) · burnaby.ca (James Cowan) · KO</w:t>
+      </w:r>
+      <w:r>
+        <w:t>R Deltek/CRM (pursuit and engagement records; check statuses AP/STC directly).</w:t>
       </w:r>
       <w:r>
         <w:t xml:space="preserve"> </w:t>
@@ -3597,7 +4300,14 @@
           <w:i/>
           <w:iCs/>
         </w:rPr>
-        <w:t>t, CIRB dates made precise (Nov 2022 finding; Jun 2023 imposition; telecom subsidiary scoped), 2026 ONSC 188 costs award added, BCIT date corrected, and absence-of-evidence findings retagged [I]. Every other load-bearing claim — the five flagship projects, the remaining seven named people, the court figures to the dollar, all four tower statuses — survived fresh primary-source re-checks.</w:t>
+        <w:t>t, CIRB dates made precise (Nov 2022 finding; Jun 2023 imposition; telecom subsidiary scoped), 2026 ONSC 188 costs award added, BCIT date corrected, and absence-of-evidence findings retagged [I]. Every other load-bearing claim — the five flagship projects, the remaining seven named people, the court figures to the dollar, all four tower statuses — survived fresh primary-source re-checks. Update 2026-07-02: invoiced-revenue figures pulled directly from the Deltek ledger (account 4001); the Trinity bookkeepin</w:t>
+      </w:r>
+      <w:r>
+        <w:rPr>
+          <w:i/>
+          <w:iCs/>
+        </w:rPr>
+        <w:t>g question resolved (two separate projects); and a US-development section added after its own research pass plus an independent fact-check (six claims tested: five confirmed, one corrected — the check found an additional approved Bay Area project the first pass had missed).</w:t>
       </w:r>
       <w:bookmarkEnd w:id="0"/>
       <w:bookmarkEnd w:id="9"/>
@@ -3620,7 +4330,7 @@
   <w:abstractNum w:abstractNumId="0" w15:restartNumberingAfterBreak="0">
     <w:nsid w:val="0000A990"/>
     <w:multiLevelType w:val="multilevel"/>
-    <w:tmpl w:val="23E6B5EC"/>
+    <w:tmpl w:val="9954D794"/>
     <w:lvl w:ilvl="0">
       <w:numFmt w:val="bullet"/>
       <w:lvlText w:val=" "/>
@@ -3697,7 +4407,7 @@
   <w:abstractNum w:abstractNumId="1" w15:restartNumberingAfterBreak="0">
     <w:nsid w:val="0000A991"/>
     <w:multiLevelType w:val="multilevel"/>
-    <w:tmpl w:val="3560F296"/>
+    <w:tmpl w:val="AC5E3B4C"/>
     <w:lvl w:ilvl="0">
       <w:numFmt w:val="bullet"/>
       <w:lvlText w:val=""/>
@@ -3801,7 +4511,7 @@
   <w:abstractNum w:abstractNumId="2" w15:restartNumberingAfterBreak="0">
     <w:nsid w:val="00A99411"/>
     <w:multiLevelType w:val="multilevel"/>
-    <w:tmpl w:val="19402762"/>
+    <w:tmpl w:val="A034811E"/>
     <w:lvl w:ilvl="0">
       <w:start w:val="1"/>
       <w:numFmt w:val="decimal"/>
@@ -3884,10 +4594,10 @@
       </w:pPr>
     </w:lvl>
   </w:abstractNum>
-  <w:num w:numId="1" w16cid:durableId="1439911026">
+  <w:num w:numId="1" w16cid:durableId="981497380">
     <w:abstractNumId w:val="0"/>
   </w:num>
-  <w:num w:numId="2" w16cid:durableId="986472345">
+  <w:num w:numId="2" w16cid:durableId="1185287942">
     <w:abstractNumId w:val="2"/>
     <w:lvlOverride w:ilvl="0">
       <w:startOverride w:val="1"/>
@@ -3917,16 +4627,16 @@
       <w:startOverride w:val="1"/>
     </w:lvlOverride>
   </w:num>
-  <w:num w:numId="3" w16cid:durableId="111290464">
+  <w:num w:numId="3" w16cid:durableId="339360125">
     <w:abstractNumId w:val="1"/>
   </w:num>
-  <w:num w:numId="4" w16cid:durableId="827135437">
+  <w:num w:numId="4" w16cid:durableId="1727416769">
     <w:abstractNumId w:val="1"/>
   </w:num>
-  <w:num w:numId="5" w16cid:durableId="677729335">
+  <w:num w:numId="5" w16cid:durableId="446894019">
     <w:abstractNumId w:val="1"/>
   </w:num>
-  <w:num w:numId="6" w16cid:durableId="1575164807">
+  <w:num w:numId="6" w16cid:durableId="1308511553">
     <w:abstractNumId w:val="2"/>
     <w:lvlOverride w:ilvl="0">
       <w:startOverride w:val="1"/>
@@ -5190,7 +5900,7 @@
     <w:name w:val="Grid Table 4"/>
     <w:basedOn w:val="TableNormal"/>
     <w:uiPriority w:val="49"/>
-    <w:rsid w:val="005F7237"/>
+    <w:rsid w:val="000625E3"/>
     <w:pPr>
       <w:spacing w:after="0"/>
     </w:pPr>

</xml_diff>

<commit_message>
docs(bd): Ledcor dossier final verification pass - pursuit stages corrected vs Deltek
Deltek project stages are the source of truth: E 10th ($175k) and Kingsway
($125k) proposals are LOST not pending (Trinity Triangle loss recorded
Jun 18 2026); win/loss record now stated plainly (5 won / 3 lost, Steveston
live). US head office corrected Irvine -> San Diego (Ledcor's own contact
page). Tag discipline fixes from internal audit (rule retagged [I], counts
reconciled, Surrey date self-contradiction fixed). 19 external claims
re-fetched: all others survived.

Co-Authored-By: Claude Fable 5 <noreply@anthropic.com>
</commit_message>
<xml_diff>
--- a/docs/KOR-Ledcor-Dossier-2026-07-01.docx
+++ b/docs/KOR-Ledcor-Dossier-2026-07-01.docx
@@ -20,7 +20,7 @@
           <w:b/>
           <w:bCs/>
         </w:rPr>
-        <w:t>KOR Structural · Prepared 2026-07-01 · Updated 2026-07-02 (invoiced-revenue figures from the ledger; US development arm added) · Every claim carries a source; anything unverified is labeled, and internal figures can be checked directly in Deltek</w:t>
+        <w:t>KOR Structural · Prepared 2026-07-01 · Updated 2026-07-02 (invoiced revenue from the ledger; every pursuit status re-verified against Deltek; US development arm added) · Every claim carries a source; anything unverified is labeled, and internal figures can be checked directly in Deltek</w:t>
       </w:r>
     </w:p>
     <w:p>
@@ -73,7 +73,7 @@
     </w:p>
     <w:p>
       <w:r>
-        <w:pict w14:anchorId="1E07121A">
+        <w:pict w14:anchorId="6930580A">
           <v:rect id="_x0000_i1025" style="width:0;height:1.5pt" o:hralign="center" o:hrstd="t" o:hr="t"/>
         </w:pict>
       </w:r>
@@ -110,10 +110,10 @@
           <w:b/>
           <w:bCs/>
         </w:rPr>
-        <w:t>5 won fee proposals (~$560k) since April 2024</w:t>
-      </w:r>
-      <w:r>
-        <w:t xml:space="preserve"> with the Ledcor family, the latest February 2026, plus ~$361k submitted and pending — and the ledger shows </w:t>
+        <w:t>5 won fee proposals ($560k) since April 2024</w:t>
+      </w:r>
+      <w:r>
+        <w:t xml:space="preserve"> with the Ledcor family, the latest February 2026, and the ledger shows </w:t>
       </w:r>
       <w:r>
         <w:rPr>
@@ -123,7 +123,36 @@
         <w:t>$103,600 invoiced to date, with three of the five projects billing as recently as June 2026</w:t>
       </w:r>
       <w:r>
-        <w:t>. The relationship is invoicing this month, not historical. [KOR books — Deltek statuses AP/STC; LedgerAR account 4001]</w:t>
+        <w:t xml:space="preserve">. The full record, stated plainly: of eight decided fee proposals KOR </w:t>
+      </w:r>
+      <w:r>
+        <w:rPr>
+          <w:b/>
+          <w:bCs/>
+        </w:rPr>
+        <w:t>won five and lost three</w:t>
+      </w:r>
+      <w:r>
+        <w:t xml:space="preserve"> (Trinity 354 E 10th $175k; Hemlock Kingsway $125k; Trinity Triangle — Deltek stage LOST on all three; the winning firm was not recorded). One proposal is live (</w:t>
+      </w:r>
+      <w:r>
+        <w:rPr>
+          <w:b/>
+          <w:bCs/>
+        </w:rPr>
+        <w:t>Steveston Richmond, $61k, submitted</w:t>
+      </w:r>
+      <w:r>
+        <w:t xml:space="preserve">) and one pursuit is open (Deep Cove). [KOR books — Deltek project stages </w:t>
+      </w:r>
+      <w:r>
+        <w:rPr>
+          <w:vertAlign w:val="subscript"/>
+        </w:rPr>
+        <w:t>WDEF</w:t>
+      </w:r>
+      <w:r>
+        <w:t>/InPursuit/LOST and LedgerAR account 4001; check them directly]</w:t>
       </w:r>
     </w:p>
     <w:p>
@@ -145,7 +174,10 @@
         <w:t>Ledcor’s development arm</w:t>
       </w:r>
       <w:r>
-        <w:t xml:space="preserve"> (Ledcor Property Investments — “LPI”), largely on the </w:t>
+        <w:t xml:space="preserve"> </w:t>
+      </w:r>
+      <w:r>
+        <w:t xml:space="preserve">(Ledcor Property Investments — “LPI”), largely on the </w:t>
       </w:r>
       <w:r>
         <w:rPr>
@@ -165,10 +197,17 @@
         <w:t>Three of its four rezonings were approved between Nov 2025 and May 2026</w:t>
       </w:r>
       <w:r>
-        <w:t xml:space="preserve"> </w:t>
-      </w:r>
-      <w:r>
-        <w:t>— the program is converting toward development permits, with structural mobilization to follow over the next 12–24 months. No structural engineer is publicly identified on any of the four [I — an absence-of-evidence finding; see Section 7].</w:t>
+        <w:t xml:space="preserve"> — the program is converting toward development permits, with structural mobilization to follow over the next 12–24 months [I — typical permit-conversion timing]. No structural engineer is publicly identified on any of the four [I]; KOR’s own books answer half of that question: </w:t>
+      </w:r>
+      <w:r>
+        <w:rPr>
+          <w:b/>
+          <w:bCs/>
+        </w:rPr>
+        <w:t>KOR holds W 10th/Arbutus and Chester, and lost the E 10th and Kingsway proposals to a competitor whose identity was not recorded</w:t>
+      </w:r>
+      <w:r>
+        <w:t xml:space="preserve"> — the program’s structural seats are split, not KOR’s outright.</w:t>
       </w:r>
     </w:p>
     <w:p>
@@ -187,7 +226,7 @@
         <w:t>Ledcor’s construction arm buys structural engineering only on design-build / early-contractor-involvement work</w:t>
       </w:r>
       <w:r>
-        <w:t xml:space="preserve"> — currently two concurrent flagships, both with Fast+Epp (BC Children’s Centre for Health Complexity; BCIT Tall Timber). On its ordinary GC/CM work the </w:t>
+        <w:t xml:space="preserve"> — the current flagship is BC Children’s Centre for Health Complexity (Fast+Epp, completing Dec 2027); the previous one, BCIT Tall Timber (also Fast+Epp), opened Aug 2025. On its ordinary GC/CM work the </w:t>
       </w:r>
       <w:r>
         <w:rPr>
@@ -219,7 +258,7 @@
         <w:t>(A)</w:t>
       </w:r>
       <w:r>
-        <w:t xml:space="preserve"> close the pending Telus Living proposals and cover the full program; </w:t>
+        <w:t xml:space="preserve"> close Steveston, debrief the two Telus Living losses, and contest the rest of the program from the half KOR holds; </w:t>
       </w:r>
       <w:r>
         <w:rPr>
@@ -229,7 +268,11 @@
         <w:t>(B)</w:t>
       </w:r>
       <w:r>
-        <w:t xml:space="preserve"> the design-build institutional lane via Ledcor’s preconstruction/BD people; </w:t>
+        <w:t xml:space="preserve"> the </w:t>
+      </w:r>
+      <w:r>
+        <w:lastRenderedPageBreak/>
+        <w:t xml:space="preserve">design-build institutional lane via Ledcor’s preconstruction/BD people; </w:t>
       </w:r>
       <w:r>
         <w:rPr>
@@ -274,7 +317,6 @@
         </w:numPr>
       </w:pPr>
       <w:r>
-        <w:lastRenderedPageBreak/>
         <w:t xml:space="preserve">This dossier includes an honest </w:t>
       </w:r>
       <w:r>
@@ -459,7 +501,7 @@
               <w:rPr>
                 <w:sz w:val="17"/>
               </w:rPr>
-              <w:t xml:space="preserve"> (AP)</w:t>
+              <w:t xml:space="preserve"> (AP = accepted proposal)</w:t>
             </w:r>
           </w:p>
         </w:tc>
@@ -879,45 +921,59 @@
               <w:rPr>
                 <w:sz w:val="17"/>
               </w:rPr>
-              <w:t>Trinity 354 E 10th Ave</w:t>
-            </w:r>
-          </w:p>
-        </w:tc>
-        <w:tc>
-          <w:tcPr>
-            <w:tcW w:w="1250" w:type="pct"/>
-          </w:tcPr>
-          <w:p>
-            <w:pPr>
-              <w:pStyle w:val="Compact"/>
-              <w:rPr>
-                <w:sz w:val="17"/>
-              </w:rPr>
-            </w:pPr>
-            <w:r>
-              <w:rPr>
-                <w:sz w:val="17"/>
-              </w:rPr>
-              <w:t>Submitted (STC)</w:t>
-            </w:r>
-          </w:p>
-        </w:tc>
-        <w:tc>
-          <w:tcPr>
-            <w:tcW w:w="1250" w:type="pct"/>
-          </w:tcPr>
-          <w:p>
-            <w:pPr>
-              <w:pStyle w:val="Compact"/>
-              <w:rPr>
-                <w:sz w:val="17"/>
-              </w:rPr>
-            </w:pPr>
-            <w:r>
-              <w:rPr>
-                <w:sz w:val="17"/>
-              </w:rPr>
-              <w:t>$175,000</w:t>
+              <w:t>Steveston No 2 Rd, Richmond</w:t>
+            </w:r>
+          </w:p>
+        </w:tc>
+        <w:tc>
+          <w:tcPr>
+            <w:tcW w:w="1250" w:type="pct"/>
+          </w:tcPr>
+          <w:p>
+            <w:pPr>
+              <w:pStyle w:val="Compact"/>
+              <w:rPr>
+                <w:sz w:val="17"/>
+              </w:rPr>
+            </w:pPr>
+            <w:r>
+              <w:rPr>
+                <w:b/>
+                <w:bCs/>
+                <w:sz w:val="17"/>
+              </w:rPr>
+              <w:t>Submitted</w:t>
+            </w:r>
+            <w:r>
+              <w:rPr>
+                <w:sz w:val="17"/>
+              </w:rPr>
+              <w:t xml:space="preserve"> </w:t>
+            </w:r>
+            <w:r>
+              <w:rPr>
+                <w:sz w:val="17"/>
+              </w:rPr>
+              <w:t>(Deltek stage: InPursuit)</w:t>
+            </w:r>
+          </w:p>
+        </w:tc>
+        <w:tc>
+          <w:tcPr>
+            <w:tcW w:w="1250" w:type="pct"/>
+          </w:tcPr>
+          <w:p>
+            <w:pPr>
+              <w:pStyle w:val="Compact"/>
+              <w:rPr>
+                <w:sz w:val="17"/>
+              </w:rPr>
+            </w:pPr>
+            <w:r>
+              <w:rPr>
+                <w:sz w:val="17"/>
+              </w:rPr>
+              <w:t>$61,000</w:t>
             </w:r>
           </w:p>
         </w:tc>
@@ -961,64 +1017,64 @@
               <w:rPr>
                 <w:sz w:val="17"/>
               </w:rPr>
-              <w:t>Hemlock Kingsway</w:t>
-            </w:r>
-          </w:p>
-        </w:tc>
-        <w:tc>
-          <w:tcPr>
-            <w:tcW w:w="1250" w:type="pct"/>
-          </w:tcPr>
-          <w:p>
-            <w:pPr>
-              <w:pStyle w:val="Compact"/>
-              <w:rPr>
-                <w:sz w:val="17"/>
-              </w:rPr>
-            </w:pPr>
-            <w:r>
-              <w:rPr>
-                <w:sz w:val="17"/>
-              </w:rPr>
-              <w:t>Submitted (STC)</w:t>
-            </w:r>
-          </w:p>
-        </w:tc>
-        <w:tc>
-          <w:tcPr>
-            <w:tcW w:w="1250" w:type="pct"/>
-          </w:tcPr>
-          <w:p>
-            <w:pPr>
-              <w:pStyle w:val="Compact"/>
-              <w:rPr>
-                <w:sz w:val="17"/>
-              </w:rPr>
-            </w:pPr>
-            <w:r>
-              <w:rPr>
-                <w:sz w:val="17"/>
-              </w:rPr>
-              <w:t>$125,000</w:t>
-            </w:r>
-          </w:p>
-        </w:tc>
-        <w:tc>
-          <w:tcPr>
-            <w:tcW w:w="1250" w:type="pct"/>
-          </w:tcPr>
-          <w:p>
-            <w:pPr>
-              <w:pStyle w:val="Compact"/>
-              <w:rPr>
-                <w:sz w:val="17"/>
-              </w:rPr>
-            </w:pPr>
-            <w:r>
-              <w:rPr>
-                <w:sz w:val="17"/>
-              </w:rPr>
-              <w:t>pending</w:t>
+              <w:t>Deep Cove North Vancouver</w:t>
+            </w:r>
+          </w:p>
+        </w:tc>
+        <w:tc>
+          <w:tcPr>
+            <w:tcW w:w="1250" w:type="pct"/>
+          </w:tcPr>
+          <w:p>
+            <w:pPr>
+              <w:pStyle w:val="Compact"/>
+              <w:rPr>
+                <w:sz w:val="17"/>
+              </w:rPr>
+            </w:pPr>
+            <w:r>
+              <w:rPr>
+                <w:sz w:val="17"/>
+              </w:rPr>
+              <w:t>Pursuing (Deltek stage: InPursuit)</w:t>
+            </w:r>
+          </w:p>
+        </w:tc>
+        <w:tc>
+          <w:tcPr>
+            <w:tcW w:w="1250" w:type="pct"/>
+          </w:tcPr>
+          <w:p>
+            <w:pPr>
+              <w:pStyle w:val="Compact"/>
+              <w:rPr>
+                <w:sz w:val="17"/>
+              </w:rPr>
+            </w:pPr>
+            <w:r>
+              <w:rPr>
+                <w:sz w:val="17"/>
+              </w:rPr>
+              <w:t>—</w:t>
+            </w:r>
+          </w:p>
+        </w:tc>
+        <w:tc>
+          <w:tcPr>
+            <w:tcW w:w="1250" w:type="pct"/>
+          </w:tcPr>
+          <w:p>
+            <w:pPr>
+              <w:pStyle w:val="Compact"/>
+              <w:rPr>
+                <w:sz w:val="17"/>
+              </w:rPr>
+            </w:pPr>
+            <w:r>
+              <w:rPr>
+                <w:sz w:val="17"/>
+              </w:rPr>
+              <w:t>open</w:t>
             </w:r>
           </w:p>
         </w:tc>
@@ -1042,64 +1098,72 @@
               <w:rPr>
                 <w:sz w:val="17"/>
               </w:rPr>
-              <w:t>Steveston No 2 Rd, Richmond</w:t>
-            </w:r>
-          </w:p>
-        </w:tc>
-        <w:tc>
-          <w:tcPr>
-            <w:tcW w:w="1250" w:type="pct"/>
-          </w:tcPr>
-          <w:p>
-            <w:pPr>
-              <w:pStyle w:val="Compact"/>
-              <w:rPr>
-                <w:sz w:val="17"/>
-              </w:rPr>
-            </w:pPr>
-            <w:r>
-              <w:rPr>
-                <w:sz w:val="17"/>
-              </w:rPr>
-              <w:t>Submitted (STC)</w:t>
-            </w:r>
-          </w:p>
-        </w:tc>
-        <w:tc>
-          <w:tcPr>
-            <w:tcW w:w="1250" w:type="pct"/>
-          </w:tcPr>
-          <w:p>
-            <w:pPr>
-              <w:pStyle w:val="Compact"/>
-              <w:rPr>
-                <w:sz w:val="17"/>
-              </w:rPr>
-            </w:pPr>
-            <w:r>
-              <w:rPr>
-                <w:sz w:val="17"/>
-              </w:rPr>
-              <w:t>$61,000</w:t>
-            </w:r>
-          </w:p>
-        </w:tc>
-        <w:tc>
-          <w:tcPr>
-            <w:tcW w:w="1250" w:type="pct"/>
-          </w:tcPr>
-          <w:p>
-            <w:pPr>
-              <w:pStyle w:val="Compact"/>
-              <w:rPr>
-                <w:sz w:val="17"/>
-              </w:rPr>
-            </w:pPr>
-            <w:r>
-              <w:rPr>
-                <w:sz w:val="17"/>
-              </w:rPr>
-              <w:t>pending</w:t>
+              <w:t>Trinity 354 E 10th Ave</w:t>
+            </w:r>
+          </w:p>
+        </w:tc>
+        <w:tc>
+          <w:tcPr>
+            <w:tcW w:w="1250" w:type="pct"/>
+          </w:tcPr>
+          <w:p>
+            <w:pPr>
+              <w:pStyle w:val="Compact"/>
+              <w:rPr>
+                <w:sz w:val="17"/>
+              </w:rPr>
+            </w:pPr>
+            <w:r>
+              <w:rPr>
+                <w:b/>
+                <w:bCs/>
+                <w:sz w:val="17"/>
+              </w:rPr>
+              <w:t>Lost</w:t>
+            </w:r>
+            <w:r>
+              <w:rPr>
+                <w:sz w:val="17"/>
+              </w:rPr>
+              <w:t xml:space="preserve"> (Deltek stage: LOST)</w:t>
+            </w:r>
+          </w:p>
+        </w:tc>
+        <w:tc>
+          <w:tcPr>
+            <w:tcW w:w="1250" w:type="pct"/>
+          </w:tcPr>
+          <w:p>
+            <w:pPr>
+              <w:pStyle w:val="Compact"/>
+              <w:rPr>
+                <w:sz w:val="17"/>
+              </w:rPr>
+            </w:pPr>
+            <w:r>
+              <w:rPr>
+                <w:sz w:val="17"/>
+              </w:rPr>
+              <w:t>$175,000</w:t>
+            </w:r>
+          </w:p>
+        </w:tc>
+        <w:tc>
+          <w:tcPr>
+            <w:tcW w:w="1250" w:type="pct"/>
+          </w:tcPr>
+          <w:p>
+            <w:pPr>
+              <w:pStyle w:val="Compact"/>
+              <w:rPr>
+                <w:sz w:val="17"/>
+              </w:rPr>
+            </w:pPr>
+            <w:r>
+              <w:rPr>
+                <w:sz w:val="17"/>
+              </w:rPr>
+              <w:t>winner not recorded</w:t>
             </w:r>
           </w:p>
         </w:tc>
@@ -1124,26 +1188,123 @@
               <w:rPr>
                 <w:sz w:val="17"/>
               </w:rPr>
-              <w:t>Deep Cove North Vancouver; Trinity Triangle E 10th</w:t>
-            </w:r>
-          </w:p>
-        </w:tc>
-        <w:tc>
-          <w:tcPr>
-            <w:tcW w:w="1250" w:type="pct"/>
-          </w:tcPr>
-          <w:p>
-            <w:pPr>
-              <w:pStyle w:val="Compact"/>
-              <w:rPr>
-                <w:sz w:val="17"/>
-              </w:rPr>
-            </w:pPr>
-            <w:r>
-              <w:rPr>
-                <w:sz w:val="17"/>
-              </w:rPr>
-              <w:t>Pursuing</w:t>
+              <w:t>Hemlock Kingsway</w:t>
+            </w:r>
+          </w:p>
+        </w:tc>
+        <w:tc>
+          <w:tcPr>
+            <w:tcW w:w="1250" w:type="pct"/>
+          </w:tcPr>
+          <w:p>
+            <w:pPr>
+              <w:pStyle w:val="Compact"/>
+              <w:rPr>
+                <w:sz w:val="17"/>
+              </w:rPr>
+            </w:pPr>
+            <w:r>
+              <w:rPr>
+                <w:b/>
+                <w:bCs/>
+                <w:sz w:val="17"/>
+              </w:rPr>
+              <w:t>Lost</w:t>
+            </w:r>
+            <w:r>
+              <w:rPr>
+                <w:sz w:val="17"/>
+              </w:rPr>
+              <w:t xml:space="preserve"> (Deltek stage: LOST)</w:t>
+            </w:r>
+          </w:p>
+        </w:tc>
+        <w:tc>
+          <w:tcPr>
+            <w:tcW w:w="1250" w:type="pct"/>
+          </w:tcPr>
+          <w:p>
+            <w:pPr>
+              <w:pStyle w:val="Compact"/>
+              <w:rPr>
+                <w:sz w:val="17"/>
+              </w:rPr>
+            </w:pPr>
+            <w:r>
+              <w:rPr>
+                <w:sz w:val="17"/>
+              </w:rPr>
+              <w:t>$125,000</w:t>
+            </w:r>
+          </w:p>
+        </w:tc>
+        <w:tc>
+          <w:tcPr>
+            <w:tcW w:w="1250" w:type="pct"/>
+          </w:tcPr>
+          <w:p>
+            <w:pPr>
+              <w:pStyle w:val="Compact"/>
+              <w:rPr>
+                <w:sz w:val="17"/>
+              </w:rPr>
+            </w:pPr>
+            <w:r>
+              <w:rPr>
+                <w:sz w:val="17"/>
+              </w:rPr>
+              <w:t>winner not recorded</w:t>
+            </w:r>
+          </w:p>
+        </w:tc>
+      </w:tr>
+      <w:tr>
+        <w:trPr>
+          <w:cantSplit/>
+        </w:trPr>
+        <w:tc>
+          <w:tcPr>
+            <w:tcW w:w="1250" w:type="pct"/>
+          </w:tcPr>
+          <w:p>
+            <w:pPr>
+              <w:pStyle w:val="Compact"/>
+              <w:rPr>
+                <w:sz w:val="17"/>
+              </w:rPr>
+            </w:pPr>
+            <w:r>
+              <w:rPr>
+                <w:sz w:val="17"/>
+              </w:rPr>
+              <w:t>Trinity Triangle E 10th</w:t>
+            </w:r>
+          </w:p>
+        </w:tc>
+        <w:tc>
+          <w:tcPr>
+            <w:tcW w:w="1250" w:type="pct"/>
+          </w:tcPr>
+          <w:p>
+            <w:pPr>
+              <w:pStyle w:val="Compact"/>
+              <w:rPr>
+                <w:sz w:val="17"/>
+              </w:rPr>
+            </w:pPr>
+            <w:r>
+              <w:rPr>
+                <w:b/>
+                <w:bCs/>
+                <w:sz w:val="17"/>
+              </w:rPr>
+              <w:t>Lost</w:t>
+            </w:r>
+            <w:r>
+              <w:rPr>
+                <w:sz w:val="17"/>
+              </w:rPr>
+              <w:t xml:space="preserve"> (Deltek stage: LOST)</w:t>
             </w:r>
           </w:p>
         </w:tc>
@@ -1181,7 +1342,7 @@
               <w:rPr>
                 <w:sz w:val="17"/>
               </w:rPr>
-              <w:t>—</w:t>
+              <w:t>winner not recorded</w:t>
             </w:r>
           </w:p>
         </w:tc>
@@ -1235,7 +1396,14 @@
         <w:t>Invoiced to date [Deltek LedgerAR, revenue account 4001]: $103,600 across five projects</w:t>
       </w:r>
       <w:r>
-        <w:t xml:space="preserve"> — 6486 Chester St $30,000 (billing Nov 2024 – Jun 2026), Telus CO Regent $27,600 (Aug 2025 – Jun 2026), 730 Raymur $25,000 (Jul 2025 – Jan 2026), Telus CO White Rock $11,000 (Feb – Jun 2026), Regent 2212 W 10th $10,000 (Jul 2024 – Jan 2025). These are invoiced dollars, not proposal values — and three of the five projects issued invoices in June 2026.</w:t>
+        <w:t xml:space="preserve"> </w:t>
+      </w:r>
+      <w:r>
+        <w:t xml:space="preserve">— 6486 Chester St (31162) $30,000 (billing Nov 2024 – Jun 2026), Telus CO Regent (70063) $27,600 (Aug 2025 – Jun 2026), 730 Raymur (31196) $25,000 (Jul 2025 – Jan 2026), Telus CO White Rock (70065) $11,000 (Feb – Jun 2026), Regent 2212 W 10th (31141) $10,000 (Jul 2024 – Jan 2025). These are invoiced dollars, not </w:t>
+      </w:r>
+      <w:r>
+        <w:lastRenderedPageBreak/>
+        <w:t>proposal values — and three of the five projects issued invoices in June 2026. Project numbers are given so every figure can be pulled up in Deltek directly.</w:t>
       </w:r>
     </w:p>
     <w:p>
@@ -1305,14 +1473,32 @@
           <w:i/>
           <w:iCs/>
         </w:rPr>
-        <w:lastRenderedPageBreak/>
         <w:t>Data note:</w:t>
       </w:r>
       <w:r>
         <w:t xml:space="preserve"> </w:t>
       </w:r>
       <w:r>
-        <w:t xml:space="preserve">the pursuit list contains Deltek sync duplicates (same project at several stages). The table above aggregates per project using the Deltek status codes (AP = accepted, STC = submitted) as the source of truth. The two “Trinity E 10th” entries are </w:t>
+        <w:t xml:space="preserve">the pursuit list contains sync duplicates (same project at several stages). The table above uses </w:t>
+      </w:r>
+      <w:r>
+        <w:rPr>
+          <w:b/>
+          <w:bCs/>
+        </w:rPr>
+        <w:t>Deltek’s current project stage as the source of truth</w:t>
+      </w:r>
+      <w:r>
+        <w:t xml:space="preserve"> (</w:t>
+      </w:r>
+      <w:r>
+        <w:rPr>
+          <w:vertAlign w:val="subscript"/>
+        </w:rPr>
+        <w:t>WDEF</w:t>
+      </w:r>
+      <w:r>
+        <w:t xml:space="preserve"> = won; InPursuit = live; LOST = lost) — re-verified directly against Deltek on 2026-07-02, and checkable there by project number. The two “Trinity E 10th” entries are </w:t>
       </w:r>
       <w:r>
         <w:rPr>
@@ -1322,7 +1508,7 @@
         <w:t>not</w:t>
       </w:r>
       <w:r>
-        <w:t xml:space="preserve"> duplicates: Deltek carries Trinity 354 E 10th (20159) and Trinity Triangle East 10th (20476) as separate regular projects — confirm the scope split with the project manager before follow-up.</w:t>
+        <w:t xml:space="preserve"> duplicates: Deltek carries Trinity 354 E 10th (20159) and Trinity Triangle East 10th (20476) as separate projects — both, honestly, lost.</w:t>
       </w:r>
     </w:p>
     <w:p>
@@ -1429,7 +1615,10 @@
         <w:t>Dave Lede — Chairman and CEO</w:t>
       </w:r>
       <w:r>
-        <w:t xml:space="preserve"> (active, not emeritus). </w:t>
+        <w:t xml:space="preserve"> </w:t>
+      </w:r>
+      <w:r>
+        <w:t xml:space="preserve">(active, not emeritus). </w:t>
       </w:r>
       <w:r>
         <w:rPr>
@@ -1488,7 +1677,10 @@
         <w:t>$5B revenue</w:t>
       </w:r>
       <w:r>
-        <w:t xml:space="preserve"> (aggregator estimates $5–5.8B), </w:t>
+        <w:t xml:space="preserve"> </w:t>
+      </w:r>
+      <w:r>
+        <w:t xml:space="preserve">(aggregator estimates $5–5.8B), </w:t>
       </w:r>
       <w:r>
         <w:rPr>
@@ -1559,7 +1751,7 @@
           <w:b/>
           <w:bCs/>
         </w:rPr>
-        <w:t>The rule [V]:</w:t>
+        <w:t>The rule [I — synthesized from the verified project set below; no single source states it]:</w:t>
       </w:r>
       <w:r>
         <w:t xml:space="preserve"> on Ledcor’s ordinary GC / construction-management work, the </w:t>
@@ -1572,7 +1764,11 @@
         <w:t>owner or architect</w:t>
       </w:r>
       <w:r>
-        <w:t xml:space="preserve"> procures the structural engineer — Ledcor doesn’t hold that decision. Ledcor picks the structural engineer only where it owns the design: </w:t>
+        <w:t xml:space="preserve"> </w:t>
+      </w:r>
+      <w:r>
+        <w:lastRenderedPageBreak/>
+        <w:t xml:space="preserve">procures the structural engineer — Ledcor doesn’t hold that decision. Ledcor picks the structural engineer only where it owns the design: </w:t>
       </w:r>
       <w:r>
         <w:rPr>
@@ -1817,7 +2013,6 @@
               <w:rPr>
                 <w:sz w:val="17"/>
               </w:rPr>
-              <w:lastRenderedPageBreak/>
               <w:t>BCIT Tall Timber Student Housing (12-st CLT)</w:t>
             </w:r>
           </w:p>
@@ -2039,26 +2234,32 @@
               <w:rPr>
                 <w:sz w:val="17"/>
               </w:rPr>
-              <w:t xml:space="preserve"> — no source; do not repeat the Glotman rumour</w:t>
-            </w:r>
-          </w:p>
-        </w:tc>
-        <w:tc>
-          <w:tcPr>
-            <w:tcW w:w="1250" w:type="pct"/>
-          </w:tcPr>
-          <w:p>
-            <w:pPr>
-              <w:pStyle w:val="Compact"/>
-              <w:rPr>
-                <w:sz w:val="17"/>
-              </w:rPr>
-            </w:pPr>
-            <w:r>
-              <w:rPr>
-                <w:sz w:val="17"/>
-              </w:rPr>
-              <w:t>In delivery [V on contractor]</w:t>
+              <w:t xml:space="preserve"> </w:t>
+            </w:r>
+            <w:r>
+              <w:rPr>
+                <w:sz w:val="17"/>
+              </w:rPr>
+              <w:t>— no source; do not repeat the Glotman rumour</w:t>
+            </w:r>
+          </w:p>
+        </w:tc>
+        <w:tc>
+          <w:tcPr>
+            <w:tcW w:w="1250" w:type="pct"/>
+          </w:tcPr>
+          <w:p>
+            <w:pPr>
+              <w:pStyle w:val="Compact"/>
+              <w:rPr>
+                <w:sz w:val="17"/>
+              </w:rPr>
+            </w:pPr>
+            <w:r>
+              <w:rPr>
+                <w:sz w:val="17"/>
+              </w:rPr>
+              <w:t>In delivery [V — contractor confirmed; SE not named]</w:t>
             </w:r>
           </w:p>
         </w:tc>
@@ -2129,13 +2330,7 @@
               <w:rPr>
                 <w:sz w:val="17"/>
               </w:rPr>
-              <w:t xml:space="preserve"> </w:t>
-            </w:r>
-            <w:r>
-              <w:rPr>
-                <w:sz w:val="17"/>
-              </w:rPr>
-              <w:t>(built by Urban One; F+E structural) — a common misattribution, corrected here</w:t>
+              <w:t xml:space="preserve"> (built by Urban One; F+E structural) — a common misattribution, corrected here</w:t>
             </w:r>
           </w:p>
         </w:tc>
@@ -2169,7 +2364,7 @@
           <w:b/>
           <w:bCs/>
         </w:rPr>
-        <w:t>Who decides [V/I]:</w:t>
+        <w:t>Who decides [V for the named people; I for the process]:</w:t>
       </w:r>
       <w:r>
         <w:t xml:space="preserve"> design-team selection sits with the </w:t>
@@ -2192,7 +2387,10 @@
         <w:t>Aaron Grenier</w:t>
       </w:r>
       <w:r>
-        <w:t xml:space="preserve"> (Director, Estimating &amp; Preconstruction — title independently confirmed twice) and </w:t>
+        <w:t xml:space="preserve"> </w:t>
+      </w:r>
+      <w:r>
+        <w:t xml:space="preserve">(Director, Estimating &amp; Preconstruction — title independently confirmed twice) and </w:t>
       </w:r>
       <w:r>
         <w:rPr>
@@ -2212,7 +2410,7 @@
         <w:t>no public design-partner roster or portal</w:t>
       </w:r>
       <w:r>
-        <w:t xml:space="preserve"> — the way in is the relationship. [V]</w:t>
+        <w:t xml:space="preserve"> — the way in is the relationship. [I — absence-of-evidence]</w:t>
       </w:r>
     </w:p>
     <w:p>
@@ -2227,7 +2425,10 @@
         <w:t>Honest boundary [V]:</w:t>
       </w:r>
       <w:r>
-        <w:t xml:space="preserve"> Ledcor’s healthcare-buildings record is thin — Cowichan, Royal Columbian, the new Surrey hospital, and Calgary Cancer Centre all went to EllisDon/Bird/PCL. Its healthcare anchor is the PHSA/BC Children’s campus. Don’t pitch Ledcor as a healthcare volume channel; pitch the </w:t>
+        <w:t xml:space="preserve"> </w:t>
+      </w:r>
+      <w:r>
+        <w:t xml:space="preserve">Ledcor’s healthcare-buildings record is thin — Cowichan, Royal Columbian, the new Surrey hospital, and Calgary Cancer Centre all went to EllisDon/Bird/PCL. Its healthcare anchor is the PHSA/BC Children’s campus. Don’t pitch Ledcor as a healthcare volume channel; pitch the </w:t>
       </w:r>
       <w:r>
         <w:rPr>
@@ -2247,6 +2448,7 @@
       <w:bookmarkStart w:id="5" w:name="expansion-paths-ranked"/>
       <w:bookmarkEnd w:id="4"/>
       <w:r>
+        <w:lastRenderedPageBreak/>
         <w:t>5. Expansion paths, ranked</w:t>
       </w:r>
     </w:p>
@@ -2259,7 +2461,7 @@
           <w:b/>
           <w:bCs/>
         </w:rPr>
-        <w:t>A. Telus Living program — active and converting, with KOR as the incumbent-of-record. [V + KOR books]</w:t>
+        <w:t>A. Telus Living program — converting, with the structural seats split and KOR holding half. [V + KOR books]</w:t>
       </w:r>
       <w:r>
         <w:t xml:space="preserve"> Four LPI/TELUS rental projects in Vancouver; </w:t>
@@ -2285,17 +2487,37 @@
         <w:t xml:space="preserve"> </w:t>
       </w:r>
       <w:r>
-        <w:t xml:space="preserve">(Chester St — 6-storey, Nov 2025; W 10th/Arbutus Walk — 25-st, Mar 2026; E 10th — 25-st, May 2026), Kingsway (25-st, 233 units) still pre-hearing (public Q&amp;A runs July 15–28, 2026). Approvals now convert through development and building permits — structural mobilization typically follows over 12–24 months, so the window is real but not a sprint. KOR’s books show wins on the W 10th and Chester addresses and </w:t>
-      </w:r>
-      <w:r>
-        <w:rPr>
-          <w:b/>
-          <w:bCs/>
-        </w:rPr>
-        <w:t>~$361k submitted and pending (E 10th $175k; Kingsway-match $125k; Steveston Richmond $61k)</w:t>
-      </w:r>
-      <w:r>
-        <w:t xml:space="preserve">. Competitive reality: LPI has used </w:t>
+        <w:t xml:space="preserve">(Chester St — 6-storey, Nov 2025; W 10th/Arbutus Walk — 25-st, Mar 2026; E 10th — 25-st, May 2026), Kingsway (25-st, 233 units) still pre-hearing (public Q&amp;A runs July 15–28, 2026). Approvals now convert through development and building permits — structural mobilization typically follows over 12–24 months, so the window is real but not a sprint. KOR’s books answer what the public record can’t: </w:t>
+      </w:r>
+      <w:r>
+        <w:rPr>
+          <w:b/>
+          <w:bCs/>
+        </w:rPr>
+        <w:t>KOR won W 10th/Arbutus and Chester</w:t>
+      </w:r>
+      <w:r>
+        <w:t xml:space="preserve"> (program invoicing ran as recently as June 2026), and </w:t>
+      </w:r>
+      <w:r>
+        <w:rPr>
+          <w:b/>
+          <w:bCs/>
+        </w:rPr>
+        <w:t>lost the E 10th ($175k) and Kingsway ($125k) proposals</w:t>
+      </w:r>
+      <w:r>
+        <w:t xml:space="preserve"> — Deltek stage LOST on both, winning firm not recorded. </w:t>
+      </w:r>
+      <w:r>
+        <w:rPr>
+          <w:b/>
+          <w:bCs/>
+        </w:rPr>
+        <w:t>Steveston Richmond ($61k) remains live</w:t>
+      </w:r>
+      <w:r>
+        <w:t xml:space="preserve">, and Deep Cove is in pursuit. Competitive reality: LPI has used </w:t>
       </w:r>
       <w:r>
         <w:rPr>
@@ -2305,11 +2527,17 @@
         <w:t>John Bryson &amp; Partners (now BMZ)</w:t>
       </w:r>
       <w:r>
-        <w:t xml:space="preserve"> on a past tower (The Charleson), and Fast+Epp holds the construction arm’s flagships — but KOR’s </w:t>
-      </w:r>
-      <w:r>
-        <w:lastRenderedPageBreak/>
-        <w:t xml:space="preserve">five wins since 2024 make KOR the program’s current incumbent. The earlier “Trinity” bookkeeping question is resolved: Deltek carries Trinity 354 E 10th and Trinity Triangle E 10th as </w:t>
+        <w:t xml:space="preserve"> on a past tower (The Charleson), Fast+Epp holds the construction arm’s flagships, and an unidentified competitor has taken program towers off KOR — per the Deltek record stamps, Trinity 354 was marked lost by Sep 2024, Kingsway by Nov 2025, and </w:t>
+      </w:r>
+      <w:r>
+        <w:rPr>
+          <w:b/>
+          <w:bCs/>
+        </w:rPr>
+        <w:t>Trinity Triangle on June 18, 2026 — two weeks ago</w:t>
+      </w:r>
+      <w:r>
+        <w:t xml:space="preserve">. Finding out who and why is a live question, not history. The earlier “Trinity” bookkeeping question is resolved: Deltek carries Trinity 354 E 10th and Trinity Triangle E 10th as </w:t>
       </w:r>
       <w:r>
         <w:rPr>
@@ -2322,7 +2550,7 @@
         <w:t xml:space="preserve"> </w:t>
       </w:r>
       <w:r>
-        <w:t xml:space="preserve">(20159, 20476) — two opportunities, not one. Action: close all three pending proposals; ask LPI (Lorne Wolinsky, VP Development, Vancouver) for program-wide coverage as the approvals convert. </w:t>
+        <w:t xml:space="preserve">(20159, 20476) — both lost. Action: close Steveston; get the loss debrief from LPI (Lorne Wolinsky, VP Development, Vancouver) — who won E 10th and Kingsway, and on what basis — and contest the program’s remaining structural work from the two projects KOR holds. </w:t>
       </w:r>
       <w:r>
         <w:rPr>
@@ -2352,50 +2580,50 @@
         <w:t>Surrey City Centre Arena</w:t>
       </w:r>
       <w:r>
+        <w:t xml:space="preserve"> changed the day before this dossier was first issued: Surrey announced an agreement in principle with </w:t>
+      </w:r>
+      <w:r>
+        <w:rPr>
+          <w:b/>
+          <w:bCs/>
+        </w:rPr>
+        <w:t>Wesgroup Properties</w:t>
+      </w:r>
+      <w:r>
+        <w:t xml:space="preserve"> — a $116.6M land swap relocating the arena to 10355 King George Blvd, now a </w:t>
+      </w:r>
+      <w:r>
+        <w:rPr>
+          <w:b/>
+          <w:bCs/>
+        </w:rPr>
+        <w:t>~$360M, 10,000-seat “City Centre Arena and Cultural Event Centre”</w:t>
+      </w:r>
+      <w:r>
+        <w:t xml:space="preserve"> (Vancouver Giants anchor tenant), </w:t>
+      </w:r>
+      <w:r>
+        <w:rPr>
+          <w:b/>
+          <w:bCs/>
+        </w:rPr>
+        <w:t>construction ~2027, completion 2030</w:t>
+      </w:r>
+      <w:r>
+        <w:t xml:space="preserve">. No design-builder, architect, or structural engineer is named (Wesgroup is the land-swap counterparty, not a confirmed builder). The design seat is likely still ahead of procurement — but on a 2027 clock, not an August one. Monitor; no evidence Ledcor is involved. (A July 2 political dispute over the land-swap price — a former mayor alleging overpayment, the current mayor denying it — does not change the announced deal terms or timeline.) </w:t>
+      </w:r>
+      <w:r>
+        <w:rPr>
+          <w:b/>
+          <w:bCs/>
+        </w:rPr>
+        <w:t>C. Alberta. [KOR books + V]</w:t>
+      </w:r>
+      <w:r>
         <w:t xml:space="preserve"> </w:t>
       </w:r>
       <w:r>
-        <w:t xml:space="preserve">changed the day this dossier was first issued: Surrey announced an agreement in principle with </w:t>
-      </w:r>
-      <w:r>
-        <w:rPr>
-          <w:b/>
-          <w:bCs/>
-        </w:rPr>
-        <w:t>Wesgroup Properties</w:t>
-      </w:r>
-      <w:r>
-        <w:t xml:space="preserve"> — a $116.6M land swap relocating the arena to 10355 King George Blvd, now a </w:t>
-      </w:r>
-      <w:r>
-        <w:rPr>
-          <w:b/>
-          <w:bCs/>
-        </w:rPr>
-        <w:t>~$360M, 10,000-seat “City Centre Arena and Cultural Event Centre”</w:t>
-      </w:r>
-      <w:r>
-        <w:t xml:space="preserve"> (Vancouver Giants anchor tenant), </w:t>
-      </w:r>
-      <w:r>
-        <w:rPr>
-          <w:b/>
-          <w:bCs/>
-        </w:rPr>
-        <w:t>construction ~2027, completion 2030</w:t>
-      </w:r>
-      <w:r>
-        <w:t xml:space="preserve">. No design-builder, architect, or structural engineer is named (Wesgroup is the land-swap counterparty, not a confirmed builder). The design seat is likely still ahead of procurement — but on a 2027 clock, not an August one. Monitor; no evidence Ledcor is involved. </w:t>
-      </w:r>
-      <w:r>
-        <w:rPr>
-          <w:b/>
-          <w:bCs/>
-        </w:rPr>
-        <w:t>C. Alberta. [KOR books + V]</w:t>
-      </w:r>
-      <w:r>
-        <w:t xml:space="preserve"> Two Alberta CRM engagements already open in KOR’s system; Grenier appears Edmonton-based [I]; Ledcor Construction won a </w:t>
+        <w:t xml:space="preserve">Two Alberta CRM engagements already open in KOR’s system; Grenier appears Edmonton-based [I]; Ledcor Construction won a </w:t>
       </w:r>
       <w:r>
         <w:rPr>
@@ -2405,10 +2633,7 @@
         <w:t>$16.6M institutional-buildings contract in Dec 2025</w:t>
       </w:r>
       <w:r>
-        <w:t xml:space="preserve"> </w:t>
-      </w:r>
-      <w:r>
-        <w:t xml:space="preserve">[KOR platform awards data]. Modest, real, and adjacent to KOR’s Edmonton push. </w:t>
+        <w:t xml:space="preserve"> [KOR platform awards data]. Modest, real, and adjacent to KOR’s Edmonton push. </w:t>
       </w:r>
       <w:r>
         <w:rPr>
@@ -2438,7 +2663,10 @@
         <w:t>next tier</w:t>
       </w:r>
       <w:r>
-        <w:t xml:space="preserve"> of institutional timber (the Northern Lights/Equilibrium precedent shows they use specialist SEs project-by-project). </w:t>
+        <w:t xml:space="preserve"> </w:t>
+      </w:r>
+      <w:r>
+        <w:t xml:space="preserve">of institutional timber (the Northern Lights/Equilibrium precedent shows they use specialist SEs project-by-project). </w:t>
       </w:r>
       <w:r>
         <w:rPr>
@@ -2448,30 +2676,44 @@
         <w:t>E. The US development arm — in KOR’s own backyard. [V — added 2026-07-02, independently fact-checked]</w:t>
       </w:r>
       <w:r>
-        <w:t xml:space="preserve"> Ledcor</w:t>
+        <w:t xml:space="preserve"> Ledcor </w:t>
+      </w:r>
+      <w:r>
+        <w:rPr>
+          <w:b/>
+          <w:bCs/>
+        </w:rPr>
+        <w:t>sold its California general-contracting business in 2019</w:t>
+      </w:r>
+      <w:r>
+        <w:t xml:space="preserve"> (Napa operation to davisReed, by its </w:t>
+      </w:r>
+      <w:r>
+        <w:lastRenderedPageBreak/>
+        <w:t xml:space="preserve">own press release, to refocus on property development and telecom) — so its real US buildings play is </w:t>
+      </w:r>
+      <w:r>
+        <w:rPr>
+          <w:b/>
+          <w:bCs/>
+        </w:rPr>
+        <w:t>Ledcor Development LP, US head office in San Diego</w:t>
       </w:r>
       <w:r>
         <w:t xml:space="preserve"> </w:t>
       </w:r>
       <w:r>
-        <w:rPr>
-          <w:b/>
-          <w:bCs/>
-        </w:rPr>
-        <w:t>sold its California general-contracting business in 2019</w:t>
-      </w:r>
-      <w:r>
-        <w:t xml:space="preserve"> (Napa operation to davisReed, by its own press release, to refocus on property development and telecom) — so its real US buildings play is </w:t>
-      </w:r>
-      <w:r>
-        <w:rPr>
-          <w:b/>
-          <w:bCs/>
-        </w:rPr>
-        <w:t>Ledcor Development LP, headquartered in Irvine, CA</w:t>
-      </w:r>
-      <w:r>
-        <w:t>: a steady, modest developer with roughly seven California projects plus one in Redmond, WA since 2016. What’s live now:</w:t>
+        <w:t xml:space="preserve">(6405 Mira Mesa Blvd, per its own contact page): a steady, modest developer with </w:t>
+      </w:r>
+      <w:r>
+        <w:rPr>
+          <w:b/>
+          <w:bCs/>
+        </w:rPr>
+        <w:t>seven identified projects — six in California, one in Redmond, WA — since 2016</w:t>
+      </w:r>
+      <w:r>
+        <w:t>. What’s live now:</w:t>
       </w:r>
     </w:p>
     <w:tbl>
@@ -2670,7 +2912,7 @@
               <w:rPr>
                 <w:sz w:val="17"/>
               </w:rPr>
-              <w:t xml:space="preserve">Broke ground Apr 2025; delivery Q1 2027 — under construction, so its design team is set: </w:t>
+              <w:t xml:space="preserve">Broke ground Apr 2025; delivery targeted Q1 2027 per the groundbreaking announcement — under construction, so its design team is set: </w:t>
             </w:r>
             <w:r>
               <w:rPr>
@@ -2750,39 +2992,31 @@
                 <w:bCs/>
                 <w:sz w:val="17"/>
               </w:rPr>
-              <w:t>approved Sept 9, 2025</w:t>
-            </w:r>
-            <w:r>
-              <w:rPr>
-                <w:sz w:val="17"/>
-              </w:rPr>
-              <w:t xml:space="preserve">; plus a 207-key hotel application and ~330 further townhomes in </w:t>
-            </w:r>
-            <w:r>
-              <w:rPr>
-                <w:sz w:val="17"/>
-              </w:rPr>
-              <w:lastRenderedPageBreak/>
-              <w:t>rezoning</w:t>
-            </w:r>
-          </w:p>
-        </w:tc>
-        <w:tc>
-          <w:tcPr>
-            <w:tcW w:w="1250" w:type="pct"/>
-          </w:tcPr>
-          <w:p>
-            <w:pPr>
-              <w:pStyle w:val="Compact"/>
-              <w:rPr>
-                <w:sz w:val="17"/>
-              </w:rPr>
-            </w:pPr>
-            <w:r>
-              <w:rPr>
-                <w:sz w:val="17"/>
-              </w:rPr>
-              <w:lastRenderedPageBreak/>
+              <w:t>approved Sept 2025</w:t>
+            </w:r>
+            <w:r>
+              <w:rPr>
+                <w:sz w:val="17"/>
+              </w:rPr>
+              <w:t xml:space="preserve"> (council vote per trade coverage); plus a 207-key hotel application and ~330 further townhomes in rezoning</w:t>
+            </w:r>
+          </w:p>
+        </w:tc>
+        <w:tc>
+          <w:tcPr>
+            <w:tcW w:w="1250" w:type="pct"/>
+          </w:tcPr>
+          <w:p>
+            <w:pPr>
+              <w:pStyle w:val="Compact"/>
+              <w:rPr>
+                <w:sz w:val="17"/>
+              </w:rPr>
+            </w:pPr>
+            <w:r>
+              <w:rPr>
+                <w:sz w:val="17"/>
+              </w:rPr>
               <w:t>Design work ahead — pursuit-shaped</w:t>
             </w:r>
           </w:p>
@@ -2924,7 +3158,10 @@
         <w:t>John Santry, SVP US Mainland</w:t>
       </w:r>
       <w:r>
-        <w:t xml:space="preserve"> (quoted at the ALARA groundbreaking; confirmed active in 2026 via independent profiles, though he does not appear on ledcor.com’s executive page — noted for accuracy); and KOR’s own ledger already holds a Southern California precedent for the family (the </w:t>
+        <w:t xml:space="preserve"> </w:t>
+      </w:r>
+      <w:r>
+        <w:t xml:space="preserve">(quoted at the ALARA groundbreaking; confirmed active in 2026 via independent profiles, though he does not appear on ledcor.com’s executive page — noted for accuracy); and KOR’s own ledger already holds a Southern California precedent for the family (the </w:t>
       </w:r>
       <w:r>
         <w:rPr>
@@ -2934,10 +3171,7 @@
         <w:t>Lede Residence, La Jolla</w:t>
       </w:r>
       <w:r>
-        <w:t xml:space="preserve"> </w:t>
-      </w:r>
-      <w:r>
-        <w:t xml:space="preserve">— Section 2). The realistic move is not chasing ALARA (designed and building) but being introduced — through the live Vancouver relationship — before the </w:t>
+        <w:t xml:space="preserve"> — Section 2). The realistic move is not chasing ALARA (designed and building) but being introduced — through the live Vancouver relationship — before the </w:t>
       </w:r>
       <w:r>
         <w:rPr>
@@ -3729,7 +3963,7 @@
               <w:rPr>
                 <w:sz w:val="17"/>
               </w:rPr>
-              <w:t>Irvine, CA</w:t>
+              <w:t>San Diego, CA</w:t>
             </w:r>
           </w:p>
         </w:tc>
@@ -3947,7 +4181,10 @@
         <w:t>Pat Patterson as Properties President</w:t>
       </w:r>
       <w:r>
-        <w:t xml:space="preserve"> (traces to a 2020 release; absent from Ledcor’s current executive and Properties team pages — re-checked 2026-07-02). Development-arm working contacts are best reached through KOR’s live LPI projects — our PMs already know them.</w:t>
+        <w:t xml:space="preserve"> </w:t>
+      </w:r>
+      <w:r>
+        <w:t>(traces to a 2020 release; absent from Ledcor’s current executive and Properties team pages — re-checked 2026-07-02). Development-arm working contacts are best reached through KOR’s live LPI projects — our PMs already know them.</w:t>
       </w:r>
     </w:p>
     <w:p>
@@ -3998,7 +4235,10 @@
         <w:t>LTS Solutions — Ledcor’s telecom-services subsidiary, not the Building division KOR would contract with</w:t>
       </w:r>
       <w:r>
-        <w:t xml:space="preserve"> — bargained in bad faith with IBEW Local 213 (finding dated </w:t>
+        <w:t xml:space="preserve"> </w:t>
+      </w:r>
+      <w:r>
+        <w:t xml:space="preserve">— bargained in bad faith with IBEW Local 213 (finding dated </w:t>
       </w:r>
       <w:r>
         <w:rPr>
@@ -4018,10 +4258,7 @@
         <w:t>separate order, June 22, 2023</w:t>
       </w:r>
       <w:r>
-        <w:t xml:space="preserve"> </w:t>
-      </w:r>
-      <w:r>
-        <w:t>— the first successful Canada Labour Code first-agreement imposition since 1986. The dispute ran from the union’s Aug 2017 certification. A formal federal adverse finding against a group company, disclosed here for completeness and scoped accurately.</w:t>
+        <w:t xml:space="preserve"> — reported in the trade press as the first successful Canada Labour Code first-agreement imposition since 1986. The dispute ran from the union’s Aug 2017 certification. A formal federal adverse finding against a group company, disclosed here for completeness and scoped accurately.</w:t>
       </w:r>
     </w:p>
     <w:p>
@@ -4050,30 +4287,30 @@
         <w:t>upheld</w:t>
       </w:r>
       <w:r>
+        <w:t xml:space="preserve"> (chronic understaffing, repeated warnings), but the court cut Ledcor’s back-charges from $5.55M claimed to $2.45M awarded and rejected its delay claim entirely for lack of critical-path analysis. The judicial criticism ran in both directions — read it as a caution on documentation discipline, not a scandal. A companion ruling, </w:t>
+      </w:r>
+      <w:r>
+        <w:rPr>
+          <w:b/>
+          <w:bCs/>
+        </w:rPr>
+        <w:t>2026 ONSC 188</w:t>
+      </w:r>
+      <w:r>
+        <w:t xml:space="preserve">, later awarded Ledcor </w:t>
+      </w:r>
+      <w:r>
+        <w:rPr>
+          <w:b/>
+          <w:bCs/>
+        </w:rPr>
+        <w:t>$415K in costs</w:t>
+      </w:r>
+      <w:r>
         <w:t xml:space="preserve"> </w:t>
       </w:r>
       <w:r>
-        <w:t xml:space="preserve">(chronic understaffing, repeated warnings), but the court cut Ledcor’s back-charges from $5.55M claimed to $2.45M awarded and rejected its delay claim entirely for lack of critical-path analysis. The judicial criticism ran in both directions — read it as a caution on documentation discipline, not a scandal. A companion ruling, </w:t>
-      </w:r>
-      <w:r>
-        <w:rPr>
-          <w:b/>
-          <w:bCs/>
-        </w:rPr>
-        <w:t>2026 ONSC 188</w:t>
-      </w:r>
-      <w:r>
-        <w:t xml:space="preserve">, later awarded Ledcor </w:t>
-      </w:r>
-      <w:r>
-        <w:rPr>
-          <w:b/>
-          <w:bCs/>
-        </w:rPr>
-        <w:t>$415K in costs</w:t>
-      </w:r>
-      <w:r>
-        <w:t xml:space="preserve"> against DMS — on balance the litigation record favours Ledcor. </w:t>
+        <w:t xml:space="preserve">against DMS — on balance the litigation record favours Ledcor. </w:t>
       </w:r>
       <w:r>
         <w:rPr>
@@ -4083,10 +4320,7 @@
         <w:t>Soft numbers [I]:</w:t>
       </w:r>
       <w:r>
-        <w:t xml:space="preserve"> </w:t>
-      </w:r>
-      <w:r>
-        <w:t xml:space="preserve">revenue/headcount/ranking figures are aggregator estimates — Ledcor publishes no audited financials. Nothing in this dossier hangs on them. </w:t>
+        <w:t xml:space="preserve"> revenue/headcount/ranking figures are aggregator estimates — Ledcor publishes no audited financials. Nothing in this dossier hangs on them. </w:t>
       </w:r>
       <w:r>
         <w:rPr>
@@ -4096,7 +4330,10 @@
         <w:t>Thin spots [V]:</w:t>
       </w:r>
       <w:r>
-        <w:t xml:space="preserve"> healthcare-buildings record beyond the PHSA campus is thin (Section 4); no data-centre building work found despite marketing; the “Telus Living — no SE named” finding is absence-of-evidence across public coverage (the rezoning booklets themselves returned errors on direct fetch). </w:t>
+        <w:t xml:space="preserve"> healthcare-buildings record beyond the PHSA campus is thin (Section 4); no data-centre building work found despite marketing; the “Telus Living — no SE named” </w:t>
+      </w:r>
+      <w:r>
+        <w:t xml:space="preserve">finding is absence-of-evidence across public coverage (the rezoning booklets themselves returned errors on direct fetch). </w:t>
       </w:r>
       <w:r>
         <w:rPr>
@@ -4138,7 +4375,27 @@
         <w:t>Now:</w:t>
       </w:r>
       <w:r>
-        <w:t xml:space="preserve"> follow up all three pending proposals (E 10th $175k; Kingsway-match $125k; Steveston $61k) — three approvals since November mean the program is converting toward design over the coming 12–24 months. (The Trinity question is resolved: Deltek carries the two E 10th records as separate projects, 20159 and 20476 — confirm the scope split with the PM.)</w:t>
+        <w:t xml:space="preserve"> close </w:t>
+      </w:r>
+      <w:r>
+        <w:rPr>
+          <w:b/>
+          <w:bCs/>
+        </w:rPr>
+        <w:t>Steveston ($61k — the one live proposal)</w:t>
+      </w:r>
+      <w:r>
+        <w:t xml:space="preserve"> and progress Deep Cove. Get the </w:t>
+      </w:r>
+      <w:r>
+        <w:rPr>
+          <w:b/>
+          <w:bCs/>
+        </w:rPr>
+        <w:t>loss debrief</w:t>
+      </w:r>
+      <w:r>
+        <w:t xml:space="preserve"> on E 10th and Kingsway (both Deltek stage LOST, winner not recorded — Trinity Triangle’s loss was recorded June 18, 2026): who won, and on fee or relationship? The answer likely names the competitor for the rest of the program.</w:t>
       </w:r>
     </w:p>
     <w:p>
@@ -4157,10 +4414,10 @@
         <w:t>July:</w:t>
       </w:r>
       <w:r>
-        <w:t xml:space="preserve"> ask Wolinsky/LPI for a program-level conversation — “cover all four Telus Living projects plus 730 Raymur follow-on” </w:t>
-      </w:r>
-      <w:r>
-        <w:t>— from inside the active relationship.</w:t>
+        <w:t xml:space="preserve"> </w:t>
+      </w:r>
+      <w:r>
+        <w:t>ask Wolinsky/LPI for a program-level conversation from inside the active relationship — KOR invoiced three LPI projects in June. The honest pitch: KOR holds W 10th and Chester; make the case to consolidate the program’s remaining structural work, and use the conversation to learn who took E 10th and Kingsway.</w:t>
       </w:r>
     </w:p>
     <w:p>
@@ -4179,7 +4436,10 @@
         <w:t>July–August:</w:t>
       </w:r>
       <w:r>
-        <w:t xml:space="preserve"> introduce KOR to Ledcor Construction’s precon/BD (Grenier, Murphy; Boyce at the relationship level) — goal: be on the call list for the next design-build pursuit’s structural seat. Reference the live LPI work as the family credential.</w:t>
+        <w:t xml:space="preserve"> </w:t>
+      </w:r>
+      <w:r>
+        <w:t>introduce KOR to Ledcor Construction’s precon/BD (Grenier, Murphy; Boyce at the relationship level) — goal: be on the call list for the next design-build pursuit’s structural seat. Reference the live LPI work as the family credential.</w:t>
       </w:r>
     </w:p>
     <w:p>
@@ -4220,7 +4480,7 @@
         <w:t xml:space="preserve"> </w:t>
       </w:r>
       <w:r>
-        <w:t xml:space="preserve">brief KOR’s San Diego office on Ledcor Development LP — ALARA delivers Q1 2027 (background), and the pursuit-shaped work is the </w:t>
+        <w:t xml:space="preserve">brief KOR’s San Diego office on Ledcor Development LP — its US head office is in San Diego, ALARA is building there now (delivery targeted Q1 2027 — background), and the pursuit-shaped work is the </w:t>
       </w:r>
       <w:r>
         <w:rPr>
@@ -4230,7 +4490,7 @@
         <w:t>Hercules “Village” townhomes (approved Sept 2025) and the Sunny Creek Carlsbad phases</w:t>
       </w:r>
       <w:r>
-        <w:t>. The introduction can travel through the live Vancouver relationship: Voysey’s mandate covers North America, and KOR’s ledger already holds the Lede Residence, La Jolla. Target: John Santry (SVP, US Mainland, Irvine).</w:t>
+        <w:t>. The introduction can travel through the live Vancouver relationship: Voysey’s mandate covers North America, and KOR’s ledger already holds the Lede Residence, La Jolla. Target: John Santry (SVP, US Mainland, San Diego).</w:t>
       </w:r>
     </w:p>
     <w:p>
@@ -4249,15 +4509,12 @@
         <w:t>Ongoing:</w:t>
       </w:r>
       <w:r>
-        <w:t xml:space="preserve"> </w:t>
-      </w:r>
-      <w:r>
-        <w:t>progress the two Alberta CRM engagements already in KOR’s system; verify Ledcor’s Edmonton buildings leadership before any AB outreach.</w:t>
+        <w:t xml:space="preserve"> progress the two Alberta CRM engagements already in KOR’s system; verify Ledcor’s Edmonton buildings leadership before any AB outreach.</w:t>
       </w:r>
     </w:p>
     <w:p>
       <w:r>
-        <w:pict w14:anchorId="104E3AE7">
+        <w:pict w14:anchorId="7EAE57B0">
           <v:rect id="_x0000_i1026" style="width:0;height:1.5pt" o:hralign="center" o:hrstd="t" o:hr="t"/>
         </w:pict>
       </w:r>
@@ -4277,13 +4534,13 @@
         <w:pStyle w:val="FirstParagraph"/>
       </w:pPr>
       <w:r>
-        <w:t>ledcor.com (executive profiles, locations, newsroom incl. Patterson-2020 and davisReed-2019 releases, US pages, project galleries) · ledcordevelopment.com (team; Sunny Creek project page) · businesswire.com (ALARA groundbreaking, Apr 2025) · pacific-structures.com + buildgc.com (Shoreline Gateway design team incl. Englekirk) · Hercules, CA council coverage (The Village approval, Sept 2025) · news.gov.bc.ca (BC Children’s DB selection; BCIT opening) · fastepp.com (BC Children’s + BCIT structural credits) · e</w:t>
-      </w:r>
-      <w:r>
-        <w:t>quilibrium-eq.com (Northern Lights College) · facilities.ubc.ca (Brock Commons — Urban One) · council.vancouver.ca (E 10th May 5 2026 + Chester Nov 13 2025 approvals) · shapeyourcity.ca + Daily Hive (3696 Kingsway) · CityHallWatch (Arbutus Walk approval) · surrey.ca + Daily Hive (City Centre Arena procurement) · ellisdon.com / bird.ca / pcl.com (healthcare counter-record) · canada.constructconnect.com (CIRB ruling; James Cowan) · CanLII via Singleton Reynolds (2025 ONSC 5100) · burnaby.ca (James Cowan) · KO</w:t>
-      </w:r>
-      <w:r>
-        <w:t>R Deltek/CRM (pursuit and engagement records; check statuses AP/STC directly).</w:t>
+        <w:t>ledcor.com (executive profiles, locations, newsroom incl. Patterson-2020 and davisReed-2019 releases, US pages, project galleries) · ledcordevelopment.com (team; contact page — US head office; Sunny Creek project page) · businesswire.com (ALARA groundbreaking, Apr 2025) · pacific-structures.com + buildgc.com (Shoreline Gateway design team incl. Englekirk) · Hercules, CA council coverage (The Village approval, Sept 2025) · news.gov.bc.ca (BC Children’s DB selection; BCIT opening) · fastepp.com (BC Children’s</w:t>
+      </w:r>
+      <w:r>
+        <w:t xml:space="preserve"> + BCIT structural credits) · equilibrium-eq.com (Northern Lights College) · facilities.ubc.ca (Brock Commons — Urban One) · council.vancouver.ca (E 10th May 5 2026 + Chester Nov 13 2025 approvals) · shapeyourcity.ca + Daily Hive (3696 Kingsway) · CityHallWatch (Arbutus Walk approval) · surrey.ca + Daily Hive (City Centre Arena procurement) · ellisdon.com / bird.ca / pcl.com (healthcare counter-record) · canada.constructconnect.com (CIRB ruling; James Cowan) · CanLII via Singleton Reynolds (2025 ONSC 5100) </w:t>
+      </w:r>
+      <w:r>
+        <w:t>· burnaby.ca (James Cowan) · KOR Deltek/CRM (pursuit and engagement records; check the project stages and fee-proposal statuses directly by the project numbers given in Section 2).</w:t>
       </w:r>
       <w:r>
         <w:t xml:space="preserve"> </w:t>
@@ -4300,14 +4557,44 @@
           <w:i/>
           <w:iCs/>
         </w:rPr>
-        <w:t>t, CIRB dates made precise (Nov 2022 finding; Jun 2023 imposition; telecom subsidiary scoped), 2026 ONSC 188 costs award added, BCIT date corrected, and absence-of-evidence findings retagged [I]. Every other load-bearing claim — the five flagship projects, the remaining seven named people, the court figures to the dollar, all four tower statuses — survived fresh primary-source re-checks. Update 2026-07-02: invoiced-revenue figures pulled directly from the Deltek ledger (account 4001); the Trinity bookkeepin</w:t>
+        <w:t>t, CIRB dates made precise (Nov 2022 finding; Jun 2023 imposition; telecom subsidiary scoped), 2026 ONSC 188 costs award added, BCIT date corrected, and absence-of-evidence findings retagged [I]. Every other load-bearing claim — the verified project set, the remaining named people, the court figures to the dollar, all four tower statuses — survived fresh primary-source re-checks. Update 2026-07-02: invoiced-revenue figures pulled directly from the Deltek ledger (account 4001);</w:t>
       </w:r>
       <w:r>
         <w:rPr>
           <w:i/>
           <w:iCs/>
         </w:rPr>
-        <w:t>g question resolved (two separate projects); and a US-development section added after its own research pass plus an independent fact-check (six claims tested: five confirmed, one corrected — the check found an additional approved Bay Area project the first pass had missed).</w:t>
+        <w:t xml:space="preserve"> </w:t>
+      </w:r>
+      <w:r>
+        <w:rPr>
+          <w:b/>
+          <w:bCs/>
+          <w:i/>
+          <w:iCs/>
+        </w:rPr>
+        <w:t>every pursuit status re-verified against Deltek’s current project stages, which corrected the earlier “pending” list — the E 10th and Kingsway proposals are lost, not pending</w:t>
+      </w:r>
+      <w:r>
+        <w:rPr>
+          <w:i/>
+          <w:iCs/>
+        </w:rPr>
+        <w:t xml:space="preserve"> </w:t>
+      </w:r>
+      <w:r>
+        <w:rPr>
+          <w:i/>
+          <w:iCs/>
+        </w:rPr>
+        <w:t>(this document reports the win/loss record as Deltek shows it); the Trinity bookkeeping question resolved (two separate projects, both lost); and a US-development section added after its own research pass plus an independent fact-check (six claims tested: five confirmed, one corrected — the check found an additional approved Bay Area project the first pass had missed). Final same-day review pair (19 external claims re-fetched; full internal-consistency audit): one factual error caught and fixed (Ledcor Deve</w:t>
+      </w:r>
+      <w:r>
+        <w:rPr>
+          <w:i/>
+          <w:iCs/>
+        </w:rPr>
+        <w:t>lopment’s US head office is San Diego, not Irvine — per its own contact page), evidence tags tightened, and every figure re-cross-checked against Deltek and the source list.</w:t>
       </w:r>
       <w:bookmarkEnd w:id="0"/>
       <w:bookmarkEnd w:id="9"/>
@@ -4330,7 +4617,7 @@
   <w:abstractNum w:abstractNumId="0" w15:restartNumberingAfterBreak="0">
     <w:nsid w:val="0000A990"/>
     <w:multiLevelType w:val="multilevel"/>
-    <w:tmpl w:val="9954D794"/>
+    <w:tmpl w:val="BE4AB2BE"/>
     <w:lvl w:ilvl="0">
       <w:numFmt w:val="bullet"/>
       <w:lvlText w:val=" "/>
@@ -4407,7 +4694,7 @@
   <w:abstractNum w:abstractNumId="1" w15:restartNumberingAfterBreak="0">
     <w:nsid w:val="0000A991"/>
     <w:multiLevelType w:val="multilevel"/>
-    <w:tmpl w:val="AC5E3B4C"/>
+    <w:tmpl w:val="097C33A2"/>
     <w:lvl w:ilvl="0">
       <w:numFmt w:val="bullet"/>
       <w:lvlText w:val=""/>
@@ -4511,7 +4798,7 @@
   <w:abstractNum w:abstractNumId="2" w15:restartNumberingAfterBreak="0">
     <w:nsid w:val="00A99411"/>
     <w:multiLevelType w:val="multilevel"/>
-    <w:tmpl w:val="A034811E"/>
+    <w:tmpl w:val="0D48D9D2"/>
     <w:lvl w:ilvl="0">
       <w:start w:val="1"/>
       <w:numFmt w:val="decimal"/>
@@ -4594,10 +4881,10 @@
       </w:pPr>
     </w:lvl>
   </w:abstractNum>
-  <w:num w:numId="1" w16cid:durableId="981497380">
+  <w:num w:numId="1" w16cid:durableId="819424783">
     <w:abstractNumId w:val="0"/>
   </w:num>
-  <w:num w:numId="2" w16cid:durableId="1185287942">
+  <w:num w:numId="2" w16cid:durableId="1643735633">
     <w:abstractNumId w:val="2"/>
     <w:lvlOverride w:ilvl="0">
       <w:startOverride w:val="1"/>
@@ -4627,16 +4914,16 @@
       <w:startOverride w:val="1"/>
     </w:lvlOverride>
   </w:num>
-  <w:num w:numId="3" w16cid:durableId="339360125">
+  <w:num w:numId="3" w16cid:durableId="846755275">
     <w:abstractNumId w:val="1"/>
   </w:num>
-  <w:num w:numId="4" w16cid:durableId="1727416769">
+  <w:num w:numId="4" w16cid:durableId="1357002425">
     <w:abstractNumId w:val="1"/>
   </w:num>
-  <w:num w:numId="5" w16cid:durableId="446894019">
+  <w:num w:numId="5" w16cid:durableId="1205828979">
     <w:abstractNumId w:val="1"/>
   </w:num>
-  <w:num w:numId="6" w16cid:durableId="1308511553">
+  <w:num w:numId="6" w16cid:durableId="148399431">
     <w:abstractNumId w:val="2"/>
     <w:lvlOverride w:ilvl="0">
       <w:startOverride w:val="1"/>
@@ -5900,7 +6187,7 @@
     <w:name w:val="Grid Table 4"/>
     <w:basedOn w:val="TableNormal"/>
     <w:uiPriority w:val="49"/>
-    <w:rsid w:val="000625E3"/>
+    <w:rsid w:val="008768CB"/>
     <w:pPr>
       <w:spacing w:after="0"/>
     </w:pPr>

</xml_diff>